<commit_message>
Document the completion figure and the button's later states
The guides described a button with one label and progress with one figure.
Both have more to them now.

quiz_button gains `perfect`, and the note that `label` is not fixed: a reader
who passed short of full marks is offered a better mark rather than the exam,
and the wording changes to say so. Both states are captured rather than
described — which took a second reader, since the best attempt is what counts
and the first had already scored full marks.

The progress table gains `percent` beside `read_percent`, with the ladder that
makes the difference concrete: three of four steps done when the reading
finishes, four of four once the paper is passed.

Co-Authored-By: Claude Opus 5 <noreply@anthropic.com>
</commit_message>
<xml_diff>
--- a/docs/Himam-API-Reference.docx
+++ b/docs/Himam-API-Reference.docx
@@ -2416,7 +2416,7 @@
           <w:sz w:val="17"/>
           <w:szCs w:val="17"/>
         </w:rPr>
-        <w:t xml:space="preserve">  "email": "api1792178812@himam.test",</w:t>
+        <w:t xml:space="preserve">  "email": "api1792229900@himam.test",</w:t>
       </w:r>
     </w:p>
     <w:p>
@@ -2581,7 +2581,7 @@
           <w:sz w:val="17"/>
           <w:szCs w:val="17"/>
         </w:rPr>
-        <w:t xml:space="preserve">  "token": "4|NqUUR5Yo8OCmt1lpnldqNNR5YOqiYZMNDxMMJ2tn7b4535e8",</w:t>
+        <w:t xml:space="preserve">  "token": "13|h45SfkpUTzoHfPOtpgrrmGUtwB92z2h8rhlvhJJvf5bda2f5",</w:t>
       </w:r>
     </w:p>
     <w:p>
@@ -2611,7 +2611,7 @@
           <w:sz w:val="17"/>
           <w:szCs w:val="17"/>
         </w:rPr>
-        <w:t xml:space="preserve">    "id": 12,</w:t>
+        <w:t xml:space="preserve">    "id": 14,</w:t>
       </w:r>
     </w:p>
     <w:p>
@@ -2641,7 +2641,7 @@
           <w:sz w:val="17"/>
           <w:szCs w:val="17"/>
         </w:rPr>
-        <w:t xml:space="preserve">    "email": "api1792178812@himam.test",</w:t>
+        <w:t xml:space="preserve">    "email": "api1792229900@himam.test",</w:t>
       </w:r>
     </w:p>
     <w:p>
@@ -2791,7 +2791,7 @@
           <w:sz w:val="17"/>
           <w:szCs w:val="17"/>
         </w:rPr>
-        <w:t xml:space="preserve">    "created_at": "2026-10-16T19:26:54+00:00"</w:t>
+        <w:t xml:space="preserve">    "created_at": "2026-10-17T09:38:21+00:00"</w:t>
       </w:r>
     </w:p>
     <w:p>
@@ -2974,7 +2974,7 @@
           <w:sz w:val="17"/>
           <w:szCs w:val="17"/>
         </w:rPr>
-        <w:t xml:space="preserve">  "email": "api1792178812@himam.test",</w:t>
+        <w:t xml:space="preserve">  "email": "api1792229900@himam.test",</w:t>
       </w:r>
     </w:p>
     <w:p>
@@ -3049,7 +3049,7 @@
           <w:sz w:val="17"/>
           <w:szCs w:val="17"/>
         </w:rPr>
-        <w:t xml:space="preserve">  "token": "5|tKy4SVC9qCzBB7biMyDgangP9Cpk777xTv0ozXm7a86ad834",</w:t>
+        <w:t xml:space="preserve">  "token": "14|zxAeHNCiA8kk8yn7eikxdPEJdugWkI0eDH8FSNIyd3ba384e",</w:t>
       </w:r>
     </w:p>
     <w:p>
@@ -3079,7 +3079,7 @@
           <w:sz w:val="17"/>
           <w:szCs w:val="17"/>
         </w:rPr>
-        <w:t xml:space="preserve">    "id": 12,</w:t>
+        <w:t xml:space="preserve">    "id": 14,</w:t>
       </w:r>
     </w:p>
     <w:p>
@@ -3109,7 +3109,7 @@
           <w:sz w:val="17"/>
           <w:szCs w:val="17"/>
         </w:rPr>
-        <w:t xml:space="preserve">    "email": "api1792178812@himam.test",</w:t>
+        <w:t xml:space="preserve">    "email": "api1792229900@himam.test",</w:t>
       </w:r>
     </w:p>
     <w:p>
@@ -3259,7 +3259,7 @@
           <w:sz w:val="17"/>
           <w:szCs w:val="17"/>
         </w:rPr>
-        <w:t xml:space="preserve">    "created_at": "2026-10-16T19:26:54+00:00"</w:t>
+        <w:t xml:space="preserve">    "created_at": "2026-10-17T09:38:21+00:00"</w:t>
       </w:r>
     </w:p>
     <w:p>
@@ -3426,7 +3426,7 @@
           <w:sz w:val="17"/>
           <w:szCs w:val="17"/>
         </w:rPr>
-        <w:t xml:space="preserve">    "id": 12,</w:t>
+        <w:t xml:space="preserve">    "id": 14,</w:t>
       </w:r>
     </w:p>
     <w:p>
@@ -3456,7 +3456,7 @@
           <w:sz w:val="17"/>
           <w:szCs w:val="17"/>
         </w:rPr>
-        <w:t xml:space="preserve">    "email": "api1792178812@himam.test",</w:t>
+        <w:t xml:space="preserve">    "email": "api1792229900@himam.test",</w:t>
       </w:r>
     </w:p>
     <w:p>
@@ -3636,7 +3636,7 @@
           <w:sz w:val="17"/>
           <w:szCs w:val="17"/>
         </w:rPr>
-        <w:t xml:space="preserve">    "created_at": "2026-10-16T19:26:54+00:00"</w:t>
+        <w:t xml:space="preserve">    "created_at": "2026-10-17T09:38:21+00:00"</w:t>
       </w:r>
     </w:p>
     <w:p>
@@ -3802,7 +3802,7 @@
           <w:sz w:val="17"/>
           <w:szCs w:val="17"/>
         </w:rPr>
-        <w:t xml:space="preserve">  "email": "api1792178812@himam.test"</w:t>
+        <w:t xml:space="preserve">  "email": "api1792229900@himam.test"</w:t>
       </w:r>
     </w:p>
     <w:p>
@@ -6060,7 +6060,7 @@
           <w:sz w:val="17"/>
           <w:szCs w:val="17"/>
         </w:rPr>
-        <w:t xml:space="preserve">      "image": "http://127.0.0.1:8006/assets/banner.svg",</w:t>
+        <w:t xml:space="preserve">      "image": "http://127.0.0.1:8007/assets/banner.svg",</w:t>
       </w:r>
     </w:p>
     <w:p>
@@ -6180,7 +6180,7 @@
           <w:sz w:val="17"/>
           <w:szCs w:val="17"/>
         </w:rPr>
-        <w:t xml:space="preserve">      "image": "http://127.0.0.1:8006/assets/certificate.png",</w:t>
+        <w:t xml:space="preserve">      "image": "http://127.0.0.1:8007/assets/certificate.png",</w:t>
       </w:r>
     </w:p>
     <w:p>
@@ -6300,7 +6300,7 @@
           <w:sz w:val="17"/>
           <w:szCs w:val="17"/>
         </w:rPr>
-        <w:t xml:space="preserve">      "image": "http://127.0.0.1:8006/assets/badge.png",</w:t>
+        <w:t xml:space="preserve">      "image": "http://127.0.0.1:8007/assets/badge.png",</w:t>
       </w:r>
     </w:p>
     <w:p>
@@ -8059,7 +8059,7 @@
           <w:sz w:val="17"/>
           <w:szCs w:val="17"/>
         </w:rPr>
-        <w:t xml:space="preserve">      "cover": "http://127.0.0.1:8006/assets/banner.svg",</w:t>
+        <w:t xml:space="preserve">      "cover": "http://127.0.0.1:8007/assets/banner.svg",</w:t>
       </w:r>
     </w:p>
     <w:p>
@@ -8389,6 +8389,21 @@
           <w:sz w:val="17"/>
           <w:szCs w:val="17"/>
         </w:rPr>
+        <w:t xml:space="preserve">        "percent": 0,</w:t>
+      </w:r>
+    </w:p>
+    <w:p>
+      <w:pPr>
+        <w:shd w:fill="F6F6F4" w:val="clear"/>
+        <w:spacing w:after="0" w:before="0" w:line="240"/>
+        <w:ind w:left="180" w:right="180"/>
+      </w:pPr>
+      <w:r>
+        <w:rPr>
+          <w:rFonts w:ascii="Consolas" w:cs="Consolas" w:eastAsia="Consolas" w:hAnsi="Consolas"/>
+          <w:sz w:val="17"/>
+          <w:szCs w:val="17"/>
+        </w:rPr>
         <w:t xml:space="preserve">        "completed": false</w:t>
       </w:r>
     </w:p>
@@ -8495,21 +8510,6 @@
           <w:szCs w:val="17"/>
         </w:rPr>
         <w:t xml:space="preserve">      "description": "Sets out the rules of ordered thinking and how to apply them to what you read, so a text becomes understanding rather than scattered facts.",</w:t>
-      </w:r>
-    </w:p>
-    <w:p>
-      <w:pPr>
-        <w:shd w:fill="F6F6F4" w:val="clear"/>
-        <w:spacing w:after="0" w:before="0" w:line="240"/>
-        <w:ind w:left="180" w:right="180"/>
-      </w:pPr>
-      <w:r>
-        <w:rPr>
-          <w:rFonts w:ascii="Consolas" w:cs="Consolas" w:eastAsia="Consolas" w:hAnsi="Consolas"/>
-          <w:sz w:val="17"/>
-          <w:szCs w:val="17"/>
-        </w:rPr>
-        <w:t xml:space="preserve">      "cover": "http://127.0.0.1:8006/assets/banner.svg",</w:t>
       </w:r>
     </w:p>
     <w:p>
@@ -8721,7 +8721,7 @@
           <w:sz w:val="17"/>
           <w:szCs w:val="17"/>
         </w:rPr>
-        <w:t xml:space="preserve">    "cover": "http://127.0.0.1:8006/assets/banner.svg",</w:t>
+        <w:t xml:space="preserve">    "cover": "http://127.0.0.1:8007/assets/banner.svg",</w:t>
       </w:r>
     </w:p>
     <w:p>
@@ -9066,7 +9066,7 @@
           <w:sz w:val="17"/>
           <w:szCs w:val="17"/>
         </w:rPr>
-        <w:t xml:space="preserve">        "pdf": "http://127.0.0.1:8006/storage/uploads/sample-section.pdf",</w:t>
+        <w:t xml:space="preserve">        "pdf": "http://127.0.0.1:8007/storage/uploads/sample-section.pdf",</w:t>
       </w:r>
     </w:p>
     <w:p>
@@ -9186,7 +9186,7 @@
           <w:sz w:val="17"/>
           <w:szCs w:val="17"/>
         </w:rPr>
-        <w:t xml:space="preserve">        "pdf": "http://127.0.0.1:8006/storage/uploads/sample-section.pdf",</w:t>
+        <w:t xml:space="preserve">        "pdf": "http://127.0.0.1:8007/storage/uploads/sample-section.pdf",</w:t>
       </w:r>
     </w:p>
     <w:p>
@@ -9518,7 +9518,7 @@
           <w:sz w:val="17"/>
           <w:szCs w:val="17"/>
         </w:rPr>
-        <w:t xml:space="preserve">    "pdf": "http://127.0.0.1:8006/storage/uploads/sample-section.pdf",</w:t>
+        <w:t xml:space="preserve">    "pdf": "http://127.0.0.1:8007/storage/uploads/sample-section.pdf",</w:t>
       </w:r>
     </w:p>
     <w:p>
@@ -10841,7 +10841,7 @@
           <w:sz w:val="17"/>
           <w:szCs w:val="17"/>
         </w:rPr>
-        <w:t xml:space="preserve">        "cover": "http://127.0.0.1:8006/assets/banner.svg",</w:t>
+        <w:t xml:space="preserve">        "cover": "http://127.0.0.1:8007/assets/banner.svg",</w:t>
       </w:r>
     </w:p>
     <w:p>
@@ -10961,6 +10961,21 @@
           <w:sz w:val="17"/>
           <w:szCs w:val="17"/>
         </w:rPr>
+        <w:t xml:space="preserve">        "percent": 0,</w:t>
+      </w:r>
+    </w:p>
+    <w:p>
+      <w:pPr>
+        <w:shd w:fill="F6F6F4" w:val="clear"/>
+        <w:spacing w:after="0" w:before="0" w:line="240"/>
+        <w:ind w:left="180" w:right="180"/>
+      </w:pPr>
+      <w:r>
+        <w:rPr>
+          <w:rFonts w:ascii="Consolas" w:cs="Consolas" w:eastAsia="Consolas" w:hAnsi="Consolas"/>
+          <w:sz w:val="17"/>
+          <w:szCs w:val="17"/>
+        </w:rPr>
         <w:t xml:space="preserve">        "sections_total": 3</w:t>
       </w:r>
     </w:p>
@@ -11051,7 +11066,7 @@
           <w:sz w:val="17"/>
           <w:szCs w:val="17"/>
         </w:rPr>
-        <w:t xml:space="preserve">        "cover": "http://127.0.0.1:8006/assets/banner.svg",</w:t>
+        <w:t xml:space="preserve">        "cover": "http://127.0.0.1:8007/assets/banner.svg",</w:t>
       </w:r>
     </w:p>
     <w:p>
@@ -11171,6 +11186,21 @@
           <w:sz w:val="17"/>
           <w:szCs w:val="17"/>
         </w:rPr>
+        <w:t xml:space="preserve">        "percent": 0,</w:t>
+      </w:r>
+    </w:p>
+    <w:p>
+      <w:pPr>
+        <w:shd w:fill="F6F6F4" w:val="clear"/>
+        <w:spacing w:after="0" w:before="0" w:line="240"/>
+        <w:ind w:left="180" w:right="180"/>
+      </w:pPr>
+      <w:r>
+        <w:rPr>
+          <w:rFonts w:ascii="Consolas" w:cs="Consolas" w:eastAsia="Consolas" w:hAnsi="Consolas"/>
+          <w:sz w:val="17"/>
+          <w:szCs w:val="17"/>
+        </w:rPr>
         <w:t xml:space="preserve">        "sections_total": 3</w:t>
       </w:r>
     </w:p>
@@ -11202,21 +11232,6 @@
           <w:szCs w:val="17"/>
         </w:rPr>
         <w:t xml:space="preserve">      {</w:t>
-      </w:r>
-    </w:p>
-    <w:p>
-      <w:pPr>
-        <w:shd w:fill="F6F6F4" w:val="clear"/>
-        <w:spacing w:after="0" w:before="0" w:line="240"/>
-        <w:ind w:left="180" w:right="180"/>
-      </w:pPr>
-      <w:r>
-        <w:rPr>
-          <w:rFonts w:ascii="Consolas" w:cs="Consolas" w:eastAsia="Consolas" w:hAnsi="Consolas"/>
-          <w:sz w:val="17"/>
-          <w:szCs w:val="17"/>
-        </w:rPr>
-        <w:t xml:space="preserve">        "id": 3,</w:t>
       </w:r>
     </w:p>
     <w:p>
@@ -12681,7 +12696,7 @@
           <w:sz w:val="17"/>
           <w:szCs w:val="17"/>
         </w:rPr>
-        <w:t xml:space="preserve">    "cover": "http://127.0.0.1:8006/assets/banner.svg",</w:t>
+        <w:t xml:space="preserve">    "cover": "http://127.0.0.1:8007/assets/banner.svg",</w:t>
       </w:r>
     </w:p>
     <w:p>
@@ -13026,7 +13041,7 @@
           <w:sz w:val="17"/>
           <w:szCs w:val="17"/>
         </w:rPr>
-        <w:t xml:space="preserve">        "pdf": "http://127.0.0.1:8006/storage/uploads/sample-section.pdf",</w:t>
+        <w:t xml:space="preserve">        "pdf": "http://127.0.0.1:8007/storage/uploads/sample-section.pdf",</w:t>
       </w:r>
     </w:p>
     <w:p>
@@ -14689,7 +14704,7 @@
           <w:sz w:val="17"/>
           <w:szCs w:val="17"/>
         </w:rPr>
-        <w:t xml:space="preserve">      "image": "http://127.0.0.1:8006/assets/badge.png",</w:t>
+        <w:t xml:space="preserve">      "image": "http://127.0.0.1:8007/assets/badge.png",</w:t>
       </w:r>
     </w:p>
     <w:p>
@@ -15605,7 +15620,7 @@
           <w:sz w:val="17"/>
           <w:szCs w:val="17"/>
         </w:rPr>
-        <w:t xml:space="preserve">      "image": "http://127.0.0.1:8006/assets/badge.png",</w:t>
+        <w:t xml:space="preserve">      "image": "http://127.0.0.1:8007/assets/badge.png",</w:t>
       </w:r>
     </w:p>
     <w:p>
@@ -15725,22 +15740,22 @@
           <w:sz w:val="17"/>
           <w:szCs w:val="17"/>
         </w:rPr>
-        <w:t xml:space="preserve">      "id": 29,</w:t>
-      </w:r>
-    </w:p>
-    <w:p>
-      <w:pPr>
-        <w:shd w:fill="F6F6F4" w:val="clear"/>
-        <w:spacing w:after="0" w:before="0" w:line="240"/>
-        <w:ind w:left="180" w:right="180"/>
-      </w:pPr>
-      <w:r>
-        <w:rPr>
-          <w:rFonts w:ascii="Consolas" w:cs="Consolas" w:eastAsia="Consolas" w:hAnsi="Consolas"/>
-          <w:sz w:val="17"/>
-          <w:szCs w:val="17"/>
-        </w:rPr>
-        <w:t xml:space="preserve">      "serial": "CERT-2026-BNYKG4",</w:t>
+        <w:t xml:space="preserve">      "id": 31,</w:t>
+      </w:r>
+    </w:p>
+    <w:p>
+      <w:pPr>
+        <w:shd w:fill="F6F6F4" w:val="clear"/>
+        <w:spacing w:after="0" w:before="0" w:line="240"/>
+        <w:ind w:left="180" w:right="180"/>
+      </w:pPr>
+      <w:r>
+        <w:rPr>
+          <w:rFonts w:ascii="Consolas" w:cs="Consolas" w:eastAsia="Consolas" w:hAnsi="Consolas"/>
+          <w:sz w:val="17"/>
+          <w:szCs w:val="17"/>
+        </w:rPr>
+        <w:t xml:space="preserve">      "serial": "CERT-2026-AUZ21L",</w:t>
       </w:r>
     </w:p>
     <w:p>
@@ -15770,22 +15785,22 @@
           <w:sz w:val="17"/>
           <w:szCs w:val="17"/>
         </w:rPr>
-        <w:t xml:space="preserve">      "issued_at": "2026-10-16",</w:t>
-      </w:r>
-    </w:p>
-    <w:p>
-      <w:pPr>
-        <w:shd w:fill="F6F6F4" w:val="clear"/>
-        <w:spacing w:after="0" w:before="0" w:line="240"/>
-        <w:ind w:left="180" w:right="180"/>
-      </w:pPr>
-      <w:r>
-        <w:rPr>
-          <w:rFonts w:ascii="Consolas" w:cs="Consolas" w:eastAsia="Consolas" w:hAnsi="Consolas"/>
-          <w:sz w:val="17"/>
-          <w:szCs w:val="17"/>
-        </w:rPr>
-        <w:t xml:space="preserve">      "verification_url": "http://127.0.0.1:8006/api/certificates/verify/691ff303-ecce-4162-ac7c-9bfbf3ae1388"</w:t>
+        <w:t xml:space="preserve">      "issued_at": "2026-10-17",</w:t>
+      </w:r>
+    </w:p>
+    <w:p>
+      <w:pPr>
+        <w:shd w:fill="F6F6F4" w:val="clear"/>
+        <w:spacing w:after="0" w:before="0" w:line="240"/>
+        <w:ind w:left="180" w:right="180"/>
+      </w:pPr>
+      <w:r>
+        <w:rPr>
+          <w:rFonts w:ascii="Consolas" w:cs="Consolas" w:eastAsia="Consolas" w:hAnsi="Consolas"/>
+          <w:sz w:val="17"/>
+          <w:szCs w:val="17"/>
+        </w:rPr>
+        <w:t xml:space="preserve">      "verification_url": "http://127.0.0.1:8007/api/certificates/verify/48339f03-952f-4793-992c-ff0da61cbc4a"</w:t>
       </w:r>
     </w:p>
     <w:p>
@@ -17106,7 +17121,7 @@
           <w:sz w:val="17"/>
           <w:szCs w:val="17"/>
         </w:rPr>
-        <w:t xml:space="preserve">      "image": "http://127.0.0.1:8006/assets/badge.png",</w:t>
+        <w:t xml:space="preserve">      "image": "http://127.0.0.1:8007/assets/badge.png",</w:t>
       </w:r>
     </w:p>
     <w:p>
@@ -17181,7 +17196,7 @@
           <w:sz w:val="17"/>
           <w:szCs w:val="17"/>
         </w:rPr>
-        <w:t xml:space="preserve">      "awarded_at": "2026-10-16 19:27:17"</w:t>
+        <w:t xml:space="preserve">      "awarded_at": "2026-10-17 09:38:41"</w:t>
       </w:r>
     </w:p>
     <w:p>
@@ -17271,7 +17286,7 @@
           <w:sz w:val="17"/>
           <w:szCs w:val="17"/>
         </w:rPr>
-        <w:t xml:space="preserve">      "image": "http://127.0.0.1:8006/assets/badge.png",</w:t>
+        <w:t xml:space="preserve">      "image": "http://127.0.0.1:8007/assets/badge.png",</w:t>
       </w:r>
     </w:p>
     <w:p>
@@ -17346,7 +17361,7 @@
           <w:sz w:val="17"/>
           <w:szCs w:val="17"/>
         </w:rPr>
-        <w:t xml:space="preserve">      "awarded_at": "2026-10-16 19:27:18"</w:t>
+        <w:t xml:space="preserve">      "awarded_at": "2026-10-17 09:38:42"</w:t>
       </w:r>
     </w:p>
     <w:p>
@@ -17421,22 +17436,22 @@
           <w:sz w:val="17"/>
           <w:szCs w:val="17"/>
         </w:rPr>
-        <w:t xml:space="preserve">      "id": 29,</w:t>
-      </w:r>
-    </w:p>
-    <w:p>
-      <w:pPr>
-        <w:shd w:fill="F6F6F4" w:val="clear"/>
-        <w:spacing w:after="0" w:before="0" w:line="240"/>
-        <w:ind w:left="180" w:right="180"/>
-      </w:pPr>
-      <w:r>
-        <w:rPr>
-          <w:rFonts w:ascii="Consolas" w:cs="Consolas" w:eastAsia="Consolas" w:hAnsi="Consolas"/>
-          <w:sz w:val="17"/>
-          <w:szCs w:val="17"/>
-        </w:rPr>
-        <w:t xml:space="preserve">      "serial": "CERT-2026-BNYKG4",</w:t>
+        <w:t xml:space="preserve">      "id": 31,</w:t>
+      </w:r>
+    </w:p>
+    <w:p>
+      <w:pPr>
+        <w:shd w:fill="F6F6F4" w:val="clear"/>
+        <w:spacing w:after="0" w:before="0" w:line="240"/>
+        <w:ind w:left="180" w:right="180"/>
+      </w:pPr>
+      <w:r>
+        <w:rPr>
+          <w:rFonts w:ascii="Consolas" w:cs="Consolas" w:eastAsia="Consolas" w:hAnsi="Consolas"/>
+          <w:sz w:val="17"/>
+          <w:szCs w:val="17"/>
+        </w:rPr>
+        <w:t xml:space="preserve">      "serial": "CERT-2026-AUZ21L",</w:t>
       </w:r>
     </w:p>
     <w:p>
@@ -17466,7 +17481,7 @@
           <w:sz w:val="17"/>
           <w:szCs w:val="17"/>
         </w:rPr>
-        <w:t xml:space="preserve">      "issued_at": "2026-10-16",</w:t>
+        <w:t xml:space="preserve">      "issued_at": "2026-10-17",</w:t>
       </w:r>
     </w:p>
     <w:p>
@@ -18172,7 +18187,7 @@
           <w:sz w:val="17"/>
           <w:szCs w:val="17"/>
         </w:rPr>
-        <w:t xml:space="preserve">              "read_at": "2026-10-16"</w:t>
+        <w:t xml:space="preserve">              "read_at": "2026-10-17"</w:t>
       </w:r>
     </w:p>
     <w:p>
@@ -18277,7 +18292,7 @@
           <w:sz w:val="17"/>
           <w:szCs w:val="17"/>
         </w:rPr>
-        <w:t xml:space="preserve">              "read_at": "2026-10-16"</w:t>
+        <w:t xml:space="preserve">              "read_at": "2026-10-17"</w:t>
       </w:r>
     </w:p>
     <w:p>
@@ -18519,7 +18534,7 @@
           <w:sz w:val="17"/>
           <w:szCs w:val="17"/>
         </w:rPr>
-        <w:t xml:space="preserve">      "image": "http://127.0.0.1:8006/assets/badge.png",</w:t>
+        <w:t xml:space="preserve">      "image": "http://127.0.0.1:8007/assets/badge.png",</w:t>
       </w:r>
     </w:p>
     <w:p>
@@ -18669,7 +18684,7 @@
           <w:sz w:val="17"/>
           <w:szCs w:val="17"/>
         </w:rPr>
-        <w:t xml:space="preserve">      "image": "http://127.0.0.1:8006/assets/badge.png",</w:t>
+        <w:t xml:space="preserve">      "image": "http://127.0.0.1:8007/assets/badge.png",</w:t>
       </w:r>
     </w:p>
     <w:p>
@@ -18819,7 +18834,7 @@
           <w:sz w:val="17"/>
           <w:szCs w:val="17"/>
         </w:rPr>
-        <w:t xml:space="preserve">      "image": "http://127.0.0.1:8006/assets/badge.png",</w:t>
+        <w:t xml:space="preserve">      "image": "http://127.0.0.1:8007/assets/badge.png",</w:t>
       </w:r>
     </w:p>
     <w:p>
@@ -18969,7 +18984,7 @@
           <w:sz w:val="17"/>
           <w:szCs w:val="17"/>
         </w:rPr>
-        <w:t xml:space="preserve">      "image": "http://127.0.0.1:8006/assets/badge.png",</w:t>
+        <w:t xml:space="preserve">      "image": "http://127.0.0.1:8007/assets/badge.png",</w:t>
       </w:r>
     </w:p>
     <w:p>
@@ -19300,7 +19315,7 @@
           <w:sz w:val="17"/>
           <w:szCs w:val="17"/>
         </w:rPr>
-        <w:t xml:space="preserve">      "avatar": "http://127.0.0.1:8006/assets/avatar-1.svg",</w:t>
+        <w:t xml:space="preserve">      "avatar": "http://127.0.0.1:8007/assets/avatar-1.svg",</w:t>
       </w:r>
     </w:p>
     <w:p>
@@ -19435,7 +19450,7 @@
           <w:sz w:val="17"/>
           <w:szCs w:val="17"/>
         </w:rPr>
-        <w:t xml:space="preserve">      "avatar": "http://127.0.0.1:8006/assets/avatar-2.svg",</w:t>
+        <w:t xml:space="preserve">      "avatar": "http://127.0.0.1:8007/assets/avatar-2.svg",</w:t>
       </w:r>
     </w:p>
     <w:p>
@@ -19570,7 +19585,7 @@
           <w:sz w:val="17"/>
           <w:szCs w:val="17"/>
         </w:rPr>
-        <w:t xml:space="preserve">      "avatar": "http://127.0.0.1:8006/assets/avatar-3.svg",</w:t>
+        <w:t xml:space="preserve">      "avatar": "http://127.0.0.1:8007/assets/avatar-3.svg",</w:t>
       </w:r>
     </w:p>
     <w:p>
@@ -19705,7 +19720,7 @@
           <w:sz w:val="17"/>
           <w:szCs w:val="17"/>
         </w:rPr>
-        <w:t xml:space="preserve">      "avatar": "http://127.0.0.1:8006/assets/avatar-1.svg",</w:t>
+        <w:t xml:space="preserve">      "avatar": "http://127.0.0.1:8007/assets/avatar-1.svg",</w:t>
       </w:r>
     </w:p>
     <w:p>
@@ -19840,7 +19855,7 @@
           <w:sz w:val="17"/>
           <w:szCs w:val="17"/>
         </w:rPr>
-        <w:t xml:space="preserve">      "avatar": "http://127.0.0.1:8006/assets/avatar-2.svg",</w:t>
+        <w:t xml:space="preserve">      "avatar": "http://127.0.0.1:8007/assets/avatar-2.svg",</w:t>
       </w:r>
     </w:p>
     <w:p>
@@ -20127,22 +20142,22 @@
           <w:sz w:val="17"/>
           <w:szCs w:val="17"/>
         </w:rPr>
-        <w:t xml:space="preserve">      "id": 29,</w:t>
-      </w:r>
-    </w:p>
-    <w:p>
-      <w:pPr>
-        <w:shd w:fill="F6F6F4" w:val="clear"/>
-        <w:spacing w:after="0" w:before="0" w:line="240"/>
-        <w:ind w:left="180" w:right="180"/>
-      </w:pPr>
-      <w:r>
-        <w:rPr>
-          <w:rFonts w:ascii="Consolas" w:cs="Consolas" w:eastAsia="Consolas" w:hAnsi="Consolas"/>
-          <w:sz w:val="17"/>
-          <w:szCs w:val="17"/>
-        </w:rPr>
-        <w:t xml:space="preserve">      "serial": "CERT-2026-BNYKG4",</w:t>
+        <w:t xml:space="preserve">      "id": 31,</w:t>
+      </w:r>
+    </w:p>
+    <w:p>
+      <w:pPr>
+        <w:shd w:fill="F6F6F4" w:val="clear"/>
+        <w:spacing w:after="0" w:before="0" w:line="240"/>
+        <w:ind w:left="180" w:right="180"/>
+      </w:pPr>
+      <w:r>
+        <w:rPr>
+          <w:rFonts w:ascii="Consolas" w:cs="Consolas" w:eastAsia="Consolas" w:hAnsi="Consolas"/>
+          <w:sz w:val="17"/>
+          <w:szCs w:val="17"/>
+        </w:rPr>
+        <w:t xml:space="preserve">      "serial": "CERT-2026-AUZ21L",</w:t>
       </w:r>
     </w:p>
     <w:p>
@@ -20172,7 +20187,7 @@
           <w:sz w:val="17"/>
           <w:szCs w:val="17"/>
         </w:rPr>
-        <w:t xml:space="preserve">      "issued_at": "2026-10-16",</w:t>
+        <w:t xml:space="preserve">      "issued_at": "2026-10-17",</w:t>
       </w:r>
     </w:p>
     <w:p>
@@ -20277,7 +20292,7 @@
           <w:sz w:val="17"/>
           <w:szCs w:val="17"/>
         </w:rPr>
-        <w:t xml:space="preserve">        "cover": "http://127.0.0.1:8006/assets/banner.svg",</w:t>
+        <w:t xml:space="preserve">        "cover": "http://127.0.0.1:8007/assets/banner.svg",</w:t>
       </w:r>
     </w:p>
     <w:p>
@@ -20457,7 +20472,7 @@
           <w:sz w:val="17"/>
           <w:szCs w:val="17"/>
         </w:rPr>
-        <w:t xml:space="preserve">      "verification_url": "http://127.0.0.1:8006/api/certificates/verify/691ff303-ecce-4162-ac7c-9bfbf3ae1388"</w:t>
+        <w:t xml:space="preserve">      "verification_url": "http://127.0.0.1:8007/api/certificates/verify/48339f03-952f-4793-992c-ff0da61cbc4a"</w:t>
       </w:r>
     </w:p>
     <w:p>
@@ -20774,37 +20789,37 @@
           <w:sz w:val="17"/>
           <w:szCs w:val="17"/>
         </w:rPr>
-        <w:t xml:space="preserve">      "serial": "CERT-2026-BNYKG4",</w:t>
-      </w:r>
-    </w:p>
-    <w:p>
-      <w:pPr>
-        <w:shd w:fill="F6F6F4" w:val="clear"/>
-        <w:spacing w:after="0" w:before="0" w:line="240"/>
-        <w:ind w:left="180" w:right="180"/>
-      </w:pPr>
-      <w:r>
-        <w:rPr>
-          <w:rFonts w:ascii="Consolas" w:cs="Consolas" w:eastAsia="Consolas" w:hAnsi="Consolas"/>
-          <w:sz w:val="17"/>
-          <w:szCs w:val="17"/>
-        </w:rPr>
-        <w:t xml:space="preserve">      "issued_at": "2026-10-16",</w:t>
-      </w:r>
-    </w:p>
-    <w:p>
-      <w:pPr>
-        <w:shd w:fill="F6F6F4" w:val="clear"/>
-        <w:spacing w:after="0" w:before="0" w:line="240"/>
-        <w:ind w:left="180" w:right="180"/>
-      </w:pPr>
-      <w:r>
-        <w:rPr>
-          <w:rFonts w:ascii="Consolas" w:cs="Consolas" w:eastAsia="Consolas" w:hAnsi="Consolas"/>
-          <w:sz w:val="17"/>
-          <w:szCs w:val="17"/>
-        </w:rPr>
-        <w:t xml:space="preserve">      "verification_url": "http://127.0.0.1:8006/api/certificates/verify/691ff303-ecce-4162-ac7c-9bfbf3ae1388",</w:t>
+        <w:t xml:space="preserve">      "serial": "CERT-2026-AUZ21L",</w:t>
+      </w:r>
+    </w:p>
+    <w:p>
+      <w:pPr>
+        <w:shd w:fill="F6F6F4" w:val="clear"/>
+        <w:spacing w:after="0" w:before="0" w:line="240"/>
+        <w:ind w:left="180" w:right="180"/>
+      </w:pPr>
+      <w:r>
+        <w:rPr>
+          <w:rFonts w:ascii="Consolas" w:cs="Consolas" w:eastAsia="Consolas" w:hAnsi="Consolas"/>
+          <w:sz w:val="17"/>
+          <w:szCs w:val="17"/>
+        </w:rPr>
+        <w:t xml:space="preserve">      "issued_at": "2026-10-17",</w:t>
+      </w:r>
+    </w:p>
+    <w:p>
+      <w:pPr>
+        <w:shd w:fill="F6F6F4" w:val="clear"/>
+        <w:spacing w:after="0" w:before="0" w:line="240"/>
+        <w:ind w:left="180" w:right="180"/>
+      </w:pPr>
+      <w:r>
+        <w:rPr>
+          <w:rFonts w:ascii="Consolas" w:cs="Consolas" w:eastAsia="Consolas" w:hAnsi="Consolas"/>
+          <w:sz w:val="17"/>
+          <w:szCs w:val="17"/>
+        </w:rPr>
+        <w:t xml:space="preserve">      "verification_url": "http://127.0.0.1:8007/api/certificates/verify/48339f03-952f-4793-992c-ff0da61cbc4a",</w:t>
       </w:r>
     </w:p>
     <w:p>
@@ -21330,7 +21345,7 @@
           <w:sz w:val="17"/>
           <w:szCs w:val="17"/>
         </w:rPr>
-        <w:t xml:space="preserve">GET /api/certificates/verify/691ff303-ecce-4162-ac7c-9bfbf3ae1388</w:t>
+        <w:t xml:space="preserve">GET /api/certificates/verify/48339f03-952f-4793-992c-ff0da61cbc4a</w:t>
       </w:r>
     </w:p>
     <w:p>
@@ -21420,7 +21435,7 @@
           <w:sz w:val="17"/>
           <w:szCs w:val="17"/>
         </w:rPr>
-        <w:t xml:space="preserve">  "serial": "CERT-2026-BNYKG4",</w:t>
+        <w:t xml:space="preserve">  "serial": "CERT-2026-AUZ21L",</w:t>
       </w:r>
     </w:p>
     <w:p>
@@ -21480,7 +21495,7 @@
           <w:sz w:val="17"/>
           <w:szCs w:val="17"/>
         </w:rPr>
-        <w:t xml:space="preserve">  "issued_at": "2026-10-16"</w:t>
+        <w:t xml:space="preserve">  "issued_at": "2026-10-17"</w:t>
       </w:r>
     </w:p>
     <w:p>
@@ -21839,7 +21854,7 @@
           <w:sz w:val="17"/>
           <w:szCs w:val="17"/>
         </w:rPr>
-        <w:t xml:space="preserve">      "id": 71,</w:t>
+        <w:t xml:space="preserve">      "id": 77,</w:t>
       </w:r>
     </w:p>
     <w:p>
@@ -21899,7 +21914,7 @@
           <w:sz w:val="17"/>
           <w:szCs w:val="17"/>
         </w:rPr>
-        <w:t xml:space="preserve">      "image": "http://127.0.0.1:8006/assets/badge.png",</w:t>
+        <w:t xml:space="preserve">      "image": "http://127.0.0.1:8007/assets/badge.png",</w:t>
       </w:r>
     </w:p>
     <w:p>
@@ -21929,7 +21944,7 @@
           <w:sz w:val="17"/>
           <w:szCs w:val="17"/>
         </w:rPr>
-        <w:t xml:space="preserve">      "published_at": "2026-10-16T19:27:18+00:00",</w:t>
+        <w:t xml:space="preserve">      "published_at": "2026-10-17T09:38:42+00:00",</w:t>
       </w:r>
     </w:p>
     <w:p>
@@ -21989,7 +22004,7 @@
           <w:sz w:val="17"/>
           <w:szCs w:val="17"/>
         </w:rPr>
-        <w:t xml:space="preserve">      "id": 72,</w:t>
+        <w:t xml:space="preserve">      "id": 78,</w:t>
       </w:r>
     </w:p>
     <w:p>
@@ -22034,7 +22049,7 @@
           <w:sz w:val="17"/>
           <w:szCs w:val="17"/>
         </w:rPr>
-        <w:t xml:space="preserve">      "body": "Congratulations — your certificate for “Introduction to Structured Reading” has been issued with serial CERT-2026-BNYKG4. You will find it on the certificates page.",</w:t>
+        <w:t xml:space="preserve">      "body": "Congratulations — your certificate for “Introduction to Structured Reading” has been issued with serial CERT-2026-AUZ21L. You will find it on the certificates page.",</w:t>
       </w:r>
     </w:p>
     <w:p>
@@ -22079,7 +22094,7 @@
           <w:sz w:val="17"/>
           <w:szCs w:val="17"/>
         </w:rPr>
-        <w:t xml:space="preserve">      "published_at": "2026-10-16T19:27:18+00:00",</w:t>
+        <w:t xml:space="preserve">      "published_at": "2026-10-17T09:38:42+00:00",</w:t>
       </w:r>
     </w:p>
     <w:p>
@@ -22139,7 +22154,7 @@
           <w:sz w:val="17"/>
           <w:szCs w:val="17"/>
         </w:rPr>
-        <w:t xml:space="preserve">      "id": 70,</w:t>
+        <w:t xml:space="preserve">      "id": 76,</w:t>
       </w:r>
     </w:p>
     <w:p>
@@ -22186,7 +22201,7 @@
           <w:sz w:val="17"/>
           <w:szCs w:val="17"/>
         </w:rPr>
-        <w:t xml:space="preserve">GET /api/announcements/71</w:t>
+        <w:t xml:space="preserve">GET /api/announcements/77</w:t>
       </w:r>
     </w:p>
     <w:p>
@@ -22291,7 +22306,7 @@
           <w:sz w:val="17"/>
           <w:szCs w:val="17"/>
         </w:rPr>
-        <w:t xml:space="preserve">    "id": 71,</w:t>
+        <w:t xml:space="preserve">    "id": 77,</w:t>
       </w:r>
     </w:p>
     <w:p>
@@ -22351,7 +22366,7 @@
           <w:sz w:val="17"/>
           <w:szCs w:val="17"/>
         </w:rPr>
-        <w:t xml:space="preserve">    "image": "http://127.0.0.1:8006/assets/badge.png",</w:t>
+        <w:t xml:space="preserve">    "image": "http://127.0.0.1:8007/assets/badge.png",</w:t>
       </w:r>
     </w:p>
     <w:p>
@@ -22381,7 +22396,7 @@
           <w:sz w:val="17"/>
           <w:szCs w:val="17"/>
         </w:rPr>
-        <w:t xml:space="preserve">    "published_at": "2026-10-16T19:27:18+00:00",</w:t>
+        <w:t xml:space="preserve">    "published_at": "2026-10-17T09:38:42+00:00",</w:t>
       </w:r>
     </w:p>
     <w:p>
@@ -22458,7 +22473,7 @@
           <w:sz w:val="17"/>
           <w:szCs w:val="17"/>
         </w:rPr>
-        <w:t xml:space="preserve">POST /api/announcements/71/read</w:t>
+        <w:t xml:space="preserve">POST /api/announcements/77/read</w:t>
       </w:r>
     </w:p>
     <w:p>
@@ -22563,7 +22578,7 @@
           <w:sz w:val="17"/>
           <w:szCs w:val="17"/>
         </w:rPr>
-        <w:t xml:space="preserve">    "id": 71,</w:t>
+        <w:t xml:space="preserve">    "id": 77,</w:t>
       </w:r>
     </w:p>
     <w:p>
@@ -24294,7 +24309,7 @@
           <w:sz w:val="17"/>
           <w:szCs w:val="17"/>
         </w:rPr>
-        <w:t xml:space="preserve">    "id": 12,</w:t>
+        <w:t xml:space="preserve">    "id": 14,</w:t>
       </w:r>
     </w:p>
     <w:p>
@@ -24324,7 +24339,7 @@
           <w:sz w:val="17"/>
           <w:szCs w:val="17"/>
         </w:rPr>
-        <w:t xml:space="preserve">    "email": "api1792178812@himam.test",</w:t>
+        <w:t xml:space="preserve">    "email": "api1792229900@himam.test",</w:t>
       </w:r>
     </w:p>
     <w:p>
@@ -24474,7 +24489,7 @@
           <w:sz w:val="17"/>
           <w:szCs w:val="17"/>
         </w:rPr>
-        <w:t xml:space="preserve">    "created_at": "2026-10-16T19:26:54+00:00"</w:t>
+        <w:t xml:space="preserve">    "created_at": "2026-10-17T09:38:21+00:00"</w:t>
       </w:r>
     </w:p>
     <w:p>
@@ -25152,7 +25167,7 @@
           <w:sz w:val="17"/>
           <w:szCs w:val="17"/>
         </w:rPr>
-        <w:t xml:space="preserve">  "email": "api1792178812@himam.test",</w:t>
+        <w:t xml:space="preserve">  "email": "api1792229900@himam.test",</w:t>
       </w:r>
     </w:p>
     <w:p>

</xml_diff>

<commit_message>
Document the certificate document
Every guide that mentions certificates now says where to get one: a public
URL, keyed by the verification code, answering the document itself with the
holder, the title, the level, the mark and the exam date already on it. The
mobile and exam guides carry the shape; the progress guide points at them
rather than repeating it.

All four rebuilt from freshly captured payloads and structurally validated.

Co-Authored-By: Claude Opus 5 <noreply@anthropic.com>
</commit_message>
<xml_diff>
--- a/docs/Himam-API-Reference.docx
+++ b/docs/Himam-API-Reference.docx
@@ -2416,7 +2416,7 @@
           <w:sz w:val="17"/>
           <w:szCs w:val="17"/>
         </w:rPr>
-        <w:t xml:space="preserve">  "email": "api1792229900@himam.test",</w:t>
+        <w:t xml:space="preserve">  "email": "api1792231566@himam.test",</w:t>
       </w:r>
     </w:p>
     <w:p>
@@ -2581,7 +2581,7 @@
           <w:sz w:val="17"/>
           <w:szCs w:val="17"/>
         </w:rPr>
-        <w:t xml:space="preserve">  "token": "13|h45SfkpUTzoHfPOtpgrrmGUtwB92z2h8rhlvhJJvf5bda2f5",</w:t>
+        <w:t xml:space="preserve">  "token": "21|5BDbhOzPg9LW9q6WKMynhTfDXYDOQvg1lF2SMsxRe7d9d9d0",</w:t>
       </w:r>
     </w:p>
     <w:p>
@@ -2611,7 +2611,7 @@
           <w:sz w:val="17"/>
           <w:szCs w:val="17"/>
         </w:rPr>
-        <w:t xml:space="preserve">    "id": 14,</w:t>
+        <w:t xml:space="preserve">    "id": 16,</w:t>
       </w:r>
     </w:p>
     <w:p>
@@ -2641,7 +2641,7 @@
           <w:sz w:val="17"/>
           <w:szCs w:val="17"/>
         </w:rPr>
-        <w:t xml:space="preserve">    "email": "api1792229900@himam.test",</w:t>
+        <w:t xml:space="preserve">    "email": "api1792231566@himam.test",</w:t>
       </w:r>
     </w:p>
     <w:p>
@@ -2791,7 +2791,7 @@
           <w:sz w:val="17"/>
           <w:szCs w:val="17"/>
         </w:rPr>
-        <w:t xml:space="preserve">    "created_at": "2026-10-17T09:38:21+00:00"</w:t>
+        <w:t xml:space="preserve">    "created_at": "2026-10-17T10:06:06+00:00"</w:t>
       </w:r>
     </w:p>
     <w:p>
@@ -2974,7 +2974,7 @@
           <w:sz w:val="17"/>
           <w:szCs w:val="17"/>
         </w:rPr>
-        <w:t xml:space="preserve">  "email": "api1792229900@himam.test",</w:t>
+        <w:t xml:space="preserve">  "email": "api1792231566@himam.test",</w:t>
       </w:r>
     </w:p>
     <w:p>
@@ -3049,7 +3049,7 @@
           <w:sz w:val="17"/>
           <w:szCs w:val="17"/>
         </w:rPr>
-        <w:t xml:space="preserve">  "token": "14|zxAeHNCiA8kk8yn7eikxdPEJdugWkI0eDH8FSNIyd3ba384e",</w:t>
+        <w:t xml:space="preserve">  "token": "22|aGEek6MTVbGweowJ9DFi45td0J5Ql765iHk9FSx1a7522a0d",</w:t>
       </w:r>
     </w:p>
     <w:p>
@@ -3079,7 +3079,7 @@
           <w:sz w:val="17"/>
           <w:szCs w:val="17"/>
         </w:rPr>
-        <w:t xml:space="preserve">    "id": 14,</w:t>
+        <w:t xml:space="preserve">    "id": 16,</w:t>
       </w:r>
     </w:p>
     <w:p>
@@ -3109,7 +3109,7 @@
           <w:sz w:val="17"/>
           <w:szCs w:val="17"/>
         </w:rPr>
-        <w:t xml:space="preserve">    "email": "api1792229900@himam.test",</w:t>
+        <w:t xml:space="preserve">    "email": "api1792231566@himam.test",</w:t>
       </w:r>
     </w:p>
     <w:p>
@@ -3259,7 +3259,7 @@
           <w:sz w:val="17"/>
           <w:szCs w:val="17"/>
         </w:rPr>
-        <w:t xml:space="preserve">    "created_at": "2026-10-17T09:38:21+00:00"</w:t>
+        <w:t xml:space="preserve">    "created_at": "2026-10-17T10:06:06+00:00"</w:t>
       </w:r>
     </w:p>
     <w:p>
@@ -3426,7 +3426,7 @@
           <w:sz w:val="17"/>
           <w:szCs w:val="17"/>
         </w:rPr>
-        <w:t xml:space="preserve">    "id": 14,</w:t>
+        <w:t xml:space="preserve">    "id": 16,</w:t>
       </w:r>
     </w:p>
     <w:p>
@@ -3456,7 +3456,7 @@
           <w:sz w:val="17"/>
           <w:szCs w:val="17"/>
         </w:rPr>
-        <w:t xml:space="preserve">    "email": "api1792229900@himam.test",</w:t>
+        <w:t xml:space="preserve">    "email": "api1792231566@himam.test",</w:t>
       </w:r>
     </w:p>
     <w:p>
@@ -3636,7 +3636,7 @@
           <w:sz w:val="17"/>
           <w:szCs w:val="17"/>
         </w:rPr>
-        <w:t xml:space="preserve">    "created_at": "2026-10-17T09:38:21+00:00"</w:t>
+        <w:t xml:space="preserve">    "created_at": "2026-10-17T10:06:06+00:00"</w:t>
       </w:r>
     </w:p>
     <w:p>
@@ -3802,7 +3802,7 @@
           <w:sz w:val="17"/>
           <w:szCs w:val="17"/>
         </w:rPr>
-        <w:t xml:space="preserve">  "email": "api1792229900@himam.test"</w:t>
+        <w:t xml:space="preserve">  "email": "api1792231566@himam.test"</w:t>
       </w:r>
     </w:p>
     <w:p>
@@ -6060,7 +6060,7 @@
           <w:sz w:val="17"/>
           <w:szCs w:val="17"/>
         </w:rPr>
-        <w:t xml:space="preserve">      "image": "http://127.0.0.1:8007/assets/banner.svg",</w:t>
+        <w:t xml:space="preserve">      "image": "http://127.0.0.1:8009/assets/banner.svg",</w:t>
       </w:r>
     </w:p>
     <w:p>
@@ -6180,7 +6180,7 @@
           <w:sz w:val="17"/>
           <w:szCs w:val="17"/>
         </w:rPr>
-        <w:t xml:space="preserve">      "image": "http://127.0.0.1:8007/assets/certificate.png",</w:t>
+        <w:t xml:space="preserve">      "image": "http://127.0.0.1:8009/assets/certificate.png",</w:t>
       </w:r>
     </w:p>
     <w:p>
@@ -6300,7 +6300,7 @@
           <w:sz w:val="17"/>
           <w:szCs w:val="17"/>
         </w:rPr>
-        <w:t xml:space="preserve">      "image": "http://127.0.0.1:8007/assets/badge.png",</w:t>
+        <w:t xml:space="preserve">      "image": "http://127.0.0.1:8009/assets/badge.png",</w:t>
       </w:r>
     </w:p>
     <w:p>
@@ -6679,7 +6679,7 @@
           <w:sz w:val="17"/>
           <w:szCs w:val="17"/>
         </w:rPr>
-        <w:t xml:space="preserve">    "updated_at": "2026-10-16T19:24:11+00:00"</w:t>
+        <w:t xml:space="preserve">    "updated_at": "2026-10-17T09:36:59+00:00"</w:t>
       </w:r>
     </w:p>
     <w:p>
@@ -8059,7 +8059,7 @@
           <w:sz w:val="17"/>
           <w:szCs w:val="17"/>
         </w:rPr>
-        <w:t xml:space="preserve">      "cover": "http://127.0.0.1:8007/assets/banner.svg",</w:t>
+        <w:t xml:space="preserve">      "cover": "http://127.0.0.1:8009/assets/banner.svg",</w:t>
       </w:r>
     </w:p>
     <w:p>
@@ -8721,7 +8721,7 @@
           <w:sz w:val="17"/>
           <w:szCs w:val="17"/>
         </w:rPr>
-        <w:t xml:space="preserve">    "cover": "http://127.0.0.1:8007/assets/banner.svg",</w:t>
+        <w:t xml:space="preserve">    "cover": "http://127.0.0.1:8009/assets/banner.svg",</w:t>
       </w:r>
     </w:p>
     <w:p>
@@ -9066,7 +9066,7 @@
           <w:sz w:val="17"/>
           <w:szCs w:val="17"/>
         </w:rPr>
-        <w:t xml:space="preserve">        "pdf": "http://127.0.0.1:8007/storage/uploads/sample-section.pdf",</w:t>
+        <w:t xml:space="preserve">        "pdf": "http://127.0.0.1:8009/storage/uploads/sample-section.pdf",</w:t>
       </w:r>
     </w:p>
     <w:p>
@@ -9186,7 +9186,7 @@
           <w:sz w:val="17"/>
           <w:szCs w:val="17"/>
         </w:rPr>
-        <w:t xml:space="preserve">        "pdf": "http://127.0.0.1:8007/storage/uploads/sample-section.pdf",</w:t>
+        <w:t xml:space="preserve">        "pdf": "http://127.0.0.1:8009/storage/uploads/sample-section.pdf",</w:t>
       </w:r>
     </w:p>
     <w:p>
@@ -9518,7 +9518,7 @@
           <w:sz w:val="17"/>
           <w:szCs w:val="17"/>
         </w:rPr>
-        <w:t xml:space="preserve">    "pdf": "http://127.0.0.1:8007/storage/uploads/sample-section.pdf",</w:t>
+        <w:t xml:space="preserve">    "pdf": "http://127.0.0.1:8009/storage/uploads/sample-section.pdf",</w:t>
       </w:r>
     </w:p>
     <w:p>
@@ -10841,7 +10841,7 @@
           <w:sz w:val="17"/>
           <w:szCs w:val="17"/>
         </w:rPr>
-        <w:t xml:space="preserve">        "cover": "http://127.0.0.1:8007/assets/banner.svg",</w:t>
+        <w:t xml:space="preserve">        "cover": "http://127.0.0.1:8009/assets/banner.svg",</w:t>
       </w:r>
     </w:p>
     <w:p>
@@ -11066,7 +11066,7 @@
           <w:sz w:val="17"/>
           <w:szCs w:val="17"/>
         </w:rPr>
-        <w:t xml:space="preserve">        "cover": "http://127.0.0.1:8007/assets/banner.svg",</w:t>
+        <w:t xml:space="preserve">        "cover": "http://127.0.0.1:8009/assets/banner.svg",</w:t>
       </w:r>
     </w:p>
     <w:p>
@@ -12696,7 +12696,7 @@
           <w:sz w:val="17"/>
           <w:szCs w:val="17"/>
         </w:rPr>
-        <w:t xml:space="preserve">    "cover": "http://127.0.0.1:8007/assets/banner.svg",</w:t>
+        <w:t xml:space="preserve">    "cover": "http://127.0.0.1:8009/assets/banner.svg",</w:t>
       </w:r>
     </w:p>
     <w:p>
@@ -13041,7 +13041,7 @@
           <w:sz w:val="17"/>
           <w:szCs w:val="17"/>
         </w:rPr>
-        <w:t xml:space="preserve">        "pdf": "http://127.0.0.1:8007/storage/uploads/sample-section.pdf",</w:t>
+        <w:t xml:space="preserve">        "pdf": "http://127.0.0.1:8009/storage/uploads/sample-section.pdf",</w:t>
       </w:r>
     </w:p>
     <w:p>
@@ -14704,7 +14704,7 @@
           <w:sz w:val="17"/>
           <w:szCs w:val="17"/>
         </w:rPr>
-        <w:t xml:space="preserve">      "image": "http://127.0.0.1:8007/assets/badge.png",</w:t>
+        <w:t xml:space="preserve">      "image": "http://127.0.0.1:8009/assets/badge.png",</w:t>
       </w:r>
     </w:p>
     <w:p>
@@ -15620,7 +15620,7 @@
           <w:sz w:val="17"/>
           <w:szCs w:val="17"/>
         </w:rPr>
-        <w:t xml:space="preserve">      "image": "http://127.0.0.1:8007/assets/badge.png",</w:t>
+        <w:t xml:space="preserve">      "image": "http://127.0.0.1:8009/assets/badge.png",</w:t>
       </w:r>
     </w:p>
     <w:p>
@@ -15740,22 +15740,22 @@
           <w:sz w:val="17"/>
           <w:szCs w:val="17"/>
         </w:rPr>
-        <w:t xml:space="preserve">      "id": 31,</w:t>
-      </w:r>
-    </w:p>
-    <w:p>
-      <w:pPr>
-        <w:shd w:fill="F6F6F4" w:val="clear"/>
-        <w:spacing w:after="0" w:before="0" w:line="240"/>
-        <w:ind w:left="180" w:right="180"/>
-      </w:pPr>
-      <w:r>
-        <w:rPr>
-          <w:rFonts w:ascii="Consolas" w:cs="Consolas" w:eastAsia="Consolas" w:hAnsi="Consolas"/>
-          <w:sz w:val="17"/>
-          <w:szCs w:val="17"/>
-        </w:rPr>
-        <w:t xml:space="preserve">      "serial": "CERT-2026-AUZ21L",</w:t>
+        <w:t xml:space="preserve">      "id": 34,</w:t>
+      </w:r>
+    </w:p>
+    <w:p>
+      <w:pPr>
+        <w:shd w:fill="F6F6F4" w:val="clear"/>
+        <w:spacing w:after="0" w:before="0" w:line="240"/>
+        <w:ind w:left="180" w:right="180"/>
+      </w:pPr>
+      <w:r>
+        <w:rPr>
+          <w:rFonts w:ascii="Consolas" w:cs="Consolas" w:eastAsia="Consolas" w:hAnsi="Consolas"/>
+          <w:sz w:val="17"/>
+          <w:szCs w:val="17"/>
+        </w:rPr>
+        <w:t xml:space="preserve">      "serial": "CERT-2026-9TNCHK",</w:t>
       </w:r>
     </w:p>
     <w:p>
@@ -15785,6 +15785,36 @@
           <w:sz w:val="17"/>
           <w:szCs w:val="17"/>
         </w:rPr>
+        <w:t xml:space="preserve">      "image": "http://127.0.0.1:8009/api/certificates/verify/55842955-a81f-4ceb-afea-76935bf94fc6/image",</w:t>
+      </w:r>
+    </w:p>
+    <w:p>
+      <w:pPr>
+        <w:shd w:fill="F6F6F4" w:val="clear"/>
+        <w:spacing w:after="0" w:before="0" w:line="240"/>
+        <w:ind w:left="180" w:right="180"/>
+      </w:pPr>
+      <w:r>
+        <w:rPr>
+          <w:rFonts w:ascii="Consolas" w:cs="Consolas" w:eastAsia="Consolas" w:hAnsi="Consolas"/>
+          <w:sz w:val="17"/>
+          <w:szCs w:val="17"/>
+        </w:rPr>
+        <w:t xml:space="preserve">      "image_template": "http://127.0.0.1:8009/storage/uploads/certificate-template.png",</w:t>
+      </w:r>
+    </w:p>
+    <w:p>
+      <w:pPr>
+        <w:shd w:fill="F6F6F4" w:val="clear"/>
+        <w:spacing w:after="0" w:before="0" w:line="240"/>
+        <w:ind w:left="180" w:right="180"/>
+      </w:pPr>
+      <w:r>
+        <w:rPr>
+          <w:rFonts w:ascii="Consolas" w:cs="Consolas" w:eastAsia="Consolas" w:hAnsi="Consolas"/>
+          <w:sz w:val="17"/>
+          <w:szCs w:val="17"/>
+        </w:rPr>
         <w:t xml:space="preserve">      "issued_at": "2026-10-17",</w:t>
       </w:r>
     </w:p>
@@ -15800,7 +15830,7 @@
           <w:sz w:val="17"/>
           <w:szCs w:val="17"/>
         </w:rPr>
-        <w:t xml:space="preserve">      "verification_url": "http://127.0.0.1:8007/api/certificates/verify/48339f03-952f-4793-992c-ff0da61cbc4a"</w:t>
+        <w:t xml:space="preserve">      "verification_url": "http://127.0.0.1:8009/api/certificates/verify/55842955-a81f-4ceb-afea-76935bf94fc6"</w:t>
       </w:r>
     </w:p>
     <w:p>
@@ -15911,66 +15941,6 @@
     <w:p>
       <w:pPr>
         <w:shd w:fill="F6F6F4" w:val="clear"/>
-        <w:spacing w:after="0" w:before="0" w:line="240"/>
-        <w:ind w:left="180" w:right="180"/>
-      </w:pPr>
-      <w:r>
-        <w:rPr>
-          <w:rFonts w:ascii="Consolas" w:cs="Consolas" w:eastAsia="Consolas" w:hAnsi="Consolas"/>
-          <w:sz w:val="17"/>
-          <w:szCs w:val="17"/>
-        </w:rPr>
-        <w:t xml:space="preserve">    "books_total": 6,</w:t>
-      </w:r>
-    </w:p>
-    <w:p>
-      <w:pPr>
-        <w:shd w:fill="F6F6F4" w:val="clear"/>
-        <w:spacing w:after="0" w:before="0" w:line="240"/>
-        <w:ind w:left="180" w:right="180"/>
-      </w:pPr>
-      <w:r>
-        <w:rPr>
-          <w:rFonts w:ascii="Consolas" w:cs="Consolas" w:eastAsia="Consolas" w:hAnsi="Consolas"/>
-          <w:sz w:val="17"/>
-          <w:szCs w:val="17"/>
-        </w:rPr>
-        <w:t xml:space="preserve">    "badges_earned": 2,</w:t>
-      </w:r>
-    </w:p>
-    <w:p>
-      <w:pPr>
-        <w:shd w:fill="F6F6F4" w:val="clear"/>
-        <w:spacing w:after="0" w:before="0" w:line="240"/>
-        <w:ind w:left="180" w:right="180"/>
-      </w:pPr>
-      <w:r>
-        <w:rPr>
-          <w:rFonts w:ascii="Consolas" w:cs="Consolas" w:eastAsia="Consolas" w:hAnsi="Consolas"/>
-          <w:sz w:val="17"/>
-          <w:szCs w:val="17"/>
-        </w:rPr>
-        <w:t xml:space="preserve">    "certificates": 1</w:t>
-      </w:r>
-    </w:p>
-    <w:p>
-      <w:pPr>
-        <w:shd w:fill="F6F6F4" w:val="clear"/>
-        <w:spacing w:after="0" w:before="0" w:line="240"/>
-        <w:ind w:left="180" w:right="180"/>
-      </w:pPr>
-      <w:r>
-        <w:rPr>
-          <w:rFonts w:ascii="Consolas" w:cs="Consolas" w:eastAsia="Consolas" w:hAnsi="Consolas"/>
-          <w:sz w:val="17"/>
-          <w:szCs w:val="17"/>
-        </w:rPr>
-        <w:t xml:space="preserve">  }</w:t>
-      </w:r>
-    </w:p>
-    <w:p>
-      <w:pPr>
-        <w:shd w:fill="F6F6F4" w:val="clear"/>
         <w:spacing w:after="160" w:before="0" w:line="240"/>
         <w:ind w:left="180" w:right="180"/>
       </w:pPr>
@@ -15980,7 +15950,7 @@
           <w:sz w:val="17"/>
           <w:szCs w:val="17"/>
         </w:rPr>
-        <w:t xml:space="preserve">}</w:t>
+        <w:t xml:space="preserve">  …</w:t>
       </w:r>
     </w:p>
     <w:p>
@@ -17121,7 +17091,7 @@
           <w:sz w:val="17"/>
           <w:szCs w:val="17"/>
         </w:rPr>
-        <w:t xml:space="preserve">      "image": "http://127.0.0.1:8007/assets/badge.png",</w:t>
+        <w:t xml:space="preserve">      "image": "http://127.0.0.1:8009/assets/badge.png",</w:t>
       </w:r>
     </w:p>
     <w:p>
@@ -17196,7 +17166,7 @@
           <w:sz w:val="17"/>
           <w:szCs w:val="17"/>
         </w:rPr>
-        <w:t xml:space="preserve">      "awarded_at": "2026-10-17 09:38:41"</w:t>
+        <w:t xml:space="preserve">      "awarded_at": "2026-10-17 10:06:15"</w:t>
       </w:r>
     </w:p>
     <w:p>
@@ -17286,7 +17256,7 @@
           <w:sz w:val="17"/>
           <w:szCs w:val="17"/>
         </w:rPr>
-        <w:t xml:space="preserve">      "image": "http://127.0.0.1:8007/assets/badge.png",</w:t>
+        <w:t xml:space="preserve">      "image": "http://127.0.0.1:8009/assets/badge.png",</w:t>
       </w:r>
     </w:p>
     <w:p>
@@ -17361,7 +17331,7 @@
           <w:sz w:val="17"/>
           <w:szCs w:val="17"/>
         </w:rPr>
-        <w:t xml:space="preserve">      "awarded_at": "2026-10-17 09:38:42"</w:t>
+        <w:t xml:space="preserve">      "awarded_at": "2026-10-17 10:06:15"</w:t>
       </w:r>
     </w:p>
     <w:p>
@@ -17436,22 +17406,22 @@
           <w:sz w:val="17"/>
           <w:szCs w:val="17"/>
         </w:rPr>
-        <w:t xml:space="preserve">      "id": 31,</w:t>
-      </w:r>
-    </w:p>
-    <w:p>
-      <w:pPr>
-        <w:shd w:fill="F6F6F4" w:val="clear"/>
-        <w:spacing w:after="0" w:before="0" w:line="240"/>
-        <w:ind w:left="180" w:right="180"/>
-      </w:pPr>
-      <w:r>
-        <w:rPr>
-          <w:rFonts w:ascii="Consolas" w:cs="Consolas" w:eastAsia="Consolas" w:hAnsi="Consolas"/>
-          <w:sz w:val="17"/>
-          <w:szCs w:val="17"/>
-        </w:rPr>
-        <w:t xml:space="preserve">      "serial": "CERT-2026-AUZ21L",</w:t>
+        <w:t xml:space="preserve">      "id": 34,</w:t>
+      </w:r>
+    </w:p>
+    <w:p>
+      <w:pPr>
+        <w:shd w:fill="F6F6F4" w:val="clear"/>
+        <w:spacing w:after="0" w:before="0" w:line="240"/>
+        <w:ind w:left="180" w:right="180"/>
+      </w:pPr>
+      <w:r>
+        <w:rPr>
+          <w:rFonts w:ascii="Consolas" w:cs="Consolas" w:eastAsia="Consolas" w:hAnsi="Consolas"/>
+          <w:sz w:val="17"/>
+          <w:szCs w:val="17"/>
+        </w:rPr>
+        <w:t xml:space="preserve">      "serial": "CERT-2026-9TNCHK",</w:t>
       </w:r>
     </w:p>
     <w:p>
@@ -17481,22 +17451,7 @@
           <w:sz w:val="17"/>
           <w:szCs w:val="17"/>
         </w:rPr>
-        <w:t xml:space="preserve">      "issued_at": "2026-10-17",</w:t>
-      </w:r>
-    </w:p>
-    <w:p>
-      <w:pPr>
-        <w:shd w:fill="F6F6F4" w:val="clear"/>
-        <w:spacing w:after="0" w:before="0" w:line="240"/>
-        <w:ind w:left="180" w:right="180"/>
-      </w:pPr>
-      <w:r>
-        <w:rPr>
-          <w:rFonts w:ascii="Consolas" w:cs="Consolas" w:eastAsia="Consolas" w:hAnsi="Consolas"/>
-          <w:sz w:val="17"/>
-          <w:szCs w:val="17"/>
-        </w:rPr>
-        <w:t xml:space="preserve">      "level": null,</w:t>
+        <w:t xml:space="preserve">      "image": "http://127.0.0.1:8009/api/certificates/verify/55842955-a81f-4ceb-afea-76935bf94fc6/image",</w:t>
       </w:r>
     </w:p>
     <w:p>
@@ -18534,7 +18489,7 @@
           <w:sz w:val="17"/>
           <w:szCs w:val="17"/>
         </w:rPr>
-        <w:t xml:space="preserve">      "image": "http://127.0.0.1:8007/assets/badge.png",</w:t>
+        <w:t xml:space="preserve">      "image": "http://127.0.0.1:8009/assets/badge.png",</w:t>
       </w:r>
     </w:p>
     <w:p>
@@ -18684,7 +18639,7 @@
           <w:sz w:val="17"/>
           <w:szCs w:val="17"/>
         </w:rPr>
-        <w:t xml:space="preserve">      "image": "http://127.0.0.1:8007/assets/badge.png",</w:t>
+        <w:t xml:space="preserve">      "image": "http://127.0.0.1:8009/assets/badge.png",</w:t>
       </w:r>
     </w:p>
     <w:p>
@@ -18834,7 +18789,7 @@
           <w:sz w:val="17"/>
           <w:szCs w:val="17"/>
         </w:rPr>
-        <w:t xml:space="preserve">      "image": "http://127.0.0.1:8007/assets/badge.png",</w:t>
+        <w:t xml:space="preserve">      "image": "http://127.0.0.1:8009/assets/badge.png",</w:t>
       </w:r>
     </w:p>
     <w:p>
@@ -18984,7 +18939,7 @@
           <w:sz w:val="17"/>
           <w:szCs w:val="17"/>
         </w:rPr>
-        <w:t xml:space="preserve">      "image": "http://127.0.0.1:8007/assets/badge.png",</w:t>
+        <w:t xml:space="preserve">      "image": "http://127.0.0.1:8009/assets/badge.png",</w:t>
       </w:r>
     </w:p>
     <w:p>
@@ -19315,7 +19270,7 @@
           <w:sz w:val="17"/>
           <w:szCs w:val="17"/>
         </w:rPr>
-        <w:t xml:space="preserve">      "avatar": "http://127.0.0.1:8007/assets/avatar-1.svg",</w:t>
+        <w:t xml:space="preserve">      "avatar": "http://127.0.0.1:8009/assets/avatar-1.svg",</w:t>
       </w:r>
     </w:p>
     <w:p>
@@ -19450,7 +19405,7 @@
           <w:sz w:val="17"/>
           <w:szCs w:val="17"/>
         </w:rPr>
-        <w:t xml:space="preserve">      "avatar": "http://127.0.0.1:8007/assets/avatar-2.svg",</w:t>
+        <w:t xml:space="preserve">      "avatar": "http://127.0.0.1:8009/assets/avatar-2.svg",</w:t>
       </w:r>
     </w:p>
     <w:p>
@@ -19585,7 +19540,7 @@
           <w:sz w:val="17"/>
           <w:szCs w:val="17"/>
         </w:rPr>
-        <w:t xml:space="preserve">      "avatar": "http://127.0.0.1:8007/assets/avatar-3.svg",</w:t>
+        <w:t xml:space="preserve">      "avatar": "http://127.0.0.1:8009/assets/avatar-3.svg",</w:t>
       </w:r>
     </w:p>
     <w:p>
@@ -19720,7 +19675,7 @@
           <w:sz w:val="17"/>
           <w:szCs w:val="17"/>
         </w:rPr>
-        <w:t xml:space="preserve">      "avatar": "http://127.0.0.1:8007/assets/avatar-1.svg",</w:t>
+        <w:t xml:space="preserve">      "avatar": "http://127.0.0.1:8009/assets/avatar-1.svg",</w:t>
       </w:r>
     </w:p>
     <w:p>
@@ -19855,7 +19810,7 @@
           <w:sz w:val="17"/>
           <w:szCs w:val="17"/>
         </w:rPr>
-        <w:t xml:space="preserve">      "avatar": "http://127.0.0.1:8007/assets/avatar-2.svg",</w:t>
+        <w:t xml:space="preserve">      "avatar": "http://127.0.0.1:8009/assets/avatar-2.svg",</w:t>
       </w:r>
     </w:p>
     <w:p>
@@ -20142,22 +20097,22 @@
           <w:sz w:val="17"/>
           <w:szCs w:val="17"/>
         </w:rPr>
-        <w:t xml:space="preserve">      "id": 31,</w:t>
-      </w:r>
-    </w:p>
-    <w:p>
-      <w:pPr>
-        <w:shd w:fill="F6F6F4" w:val="clear"/>
-        <w:spacing w:after="0" w:before="0" w:line="240"/>
-        <w:ind w:left="180" w:right="180"/>
-      </w:pPr>
-      <w:r>
-        <w:rPr>
-          <w:rFonts w:ascii="Consolas" w:cs="Consolas" w:eastAsia="Consolas" w:hAnsi="Consolas"/>
-          <w:sz w:val="17"/>
-          <w:szCs w:val="17"/>
-        </w:rPr>
-        <w:t xml:space="preserve">      "serial": "CERT-2026-AUZ21L",</w:t>
+        <w:t xml:space="preserve">      "id": 34,</w:t>
+      </w:r>
+    </w:p>
+    <w:p>
+      <w:pPr>
+        <w:shd w:fill="F6F6F4" w:val="clear"/>
+        <w:spacing w:after="0" w:before="0" w:line="240"/>
+        <w:ind w:left="180" w:right="180"/>
+      </w:pPr>
+      <w:r>
+        <w:rPr>
+          <w:rFonts w:ascii="Consolas" w:cs="Consolas" w:eastAsia="Consolas" w:hAnsi="Consolas"/>
+          <w:sz w:val="17"/>
+          <w:szCs w:val="17"/>
+        </w:rPr>
+        <w:t xml:space="preserve">      "serial": "CERT-2026-9TNCHK",</w:t>
       </w:r>
     </w:p>
     <w:p>
@@ -20187,6 +20142,36 @@
           <w:sz w:val="17"/>
           <w:szCs w:val="17"/>
         </w:rPr>
+        <w:t xml:space="preserve">      "image": "http://127.0.0.1:8009/api/certificates/verify/55842955-a81f-4ceb-afea-76935bf94fc6/image",</w:t>
+      </w:r>
+    </w:p>
+    <w:p>
+      <w:pPr>
+        <w:shd w:fill="F6F6F4" w:val="clear"/>
+        <w:spacing w:after="0" w:before="0" w:line="240"/>
+        <w:ind w:left="180" w:right="180"/>
+      </w:pPr>
+      <w:r>
+        <w:rPr>
+          <w:rFonts w:ascii="Consolas" w:cs="Consolas" w:eastAsia="Consolas" w:hAnsi="Consolas"/>
+          <w:sz w:val="17"/>
+          <w:szCs w:val="17"/>
+        </w:rPr>
+        <w:t xml:space="preserve">      "image_template": "http://127.0.0.1:8009/storage/uploads/certificate-template.png",</w:t>
+      </w:r>
+    </w:p>
+    <w:p>
+      <w:pPr>
+        <w:shd w:fill="F6F6F4" w:val="clear"/>
+        <w:spacing w:after="0" w:before="0" w:line="240"/>
+        <w:ind w:left="180" w:right="180"/>
+      </w:pPr>
+      <w:r>
+        <w:rPr>
+          <w:rFonts w:ascii="Consolas" w:cs="Consolas" w:eastAsia="Consolas" w:hAnsi="Consolas"/>
+          <w:sz w:val="17"/>
+          <w:szCs w:val="17"/>
+        </w:rPr>
         <w:t xml:space="preserve">      "issued_at": "2026-10-17",</w:t>
       </w:r>
     </w:p>
@@ -20292,7 +20277,7 @@
           <w:sz w:val="17"/>
           <w:szCs w:val="17"/>
         </w:rPr>
-        <w:t xml:space="preserve">        "cover": "http://127.0.0.1:8007/assets/banner.svg",</w:t>
+        <w:t xml:space="preserve">        "cover": "http://127.0.0.1:8009/assets/banner.svg",</w:t>
       </w:r>
     </w:p>
     <w:p>
@@ -20463,51 +20448,6 @@
     <w:p>
       <w:pPr>
         <w:shd w:fill="F6F6F4" w:val="clear"/>
-        <w:spacing w:after="0" w:before="0" w:line="240"/>
-        <w:ind w:left="180" w:right="180"/>
-      </w:pPr>
-      <w:r>
-        <w:rPr>
-          <w:rFonts w:ascii="Consolas" w:cs="Consolas" w:eastAsia="Consolas" w:hAnsi="Consolas"/>
-          <w:sz w:val="17"/>
-          <w:szCs w:val="17"/>
-        </w:rPr>
-        <w:t xml:space="preserve">      "verification_url": "http://127.0.0.1:8007/api/certificates/verify/48339f03-952f-4793-992c-ff0da61cbc4a"</w:t>
-      </w:r>
-    </w:p>
-    <w:p>
-      <w:pPr>
-        <w:shd w:fill="F6F6F4" w:val="clear"/>
-        <w:spacing w:after="0" w:before="0" w:line="240"/>
-        <w:ind w:left="180" w:right="180"/>
-      </w:pPr>
-      <w:r>
-        <w:rPr>
-          <w:rFonts w:ascii="Consolas" w:cs="Consolas" w:eastAsia="Consolas" w:hAnsi="Consolas"/>
-          <w:sz w:val="17"/>
-          <w:szCs w:val="17"/>
-        </w:rPr>
-        <w:t xml:space="preserve">    }</w:t>
-      </w:r>
-    </w:p>
-    <w:p>
-      <w:pPr>
-        <w:shd w:fill="F6F6F4" w:val="clear"/>
-        <w:spacing w:after="0" w:before="0" w:line="240"/>
-        <w:ind w:left="180" w:right="180"/>
-      </w:pPr>
-      <w:r>
-        <w:rPr>
-          <w:rFonts w:ascii="Consolas" w:cs="Consolas" w:eastAsia="Consolas" w:hAnsi="Consolas"/>
-          <w:sz w:val="17"/>
-          <w:szCs w:val="17"/>
-        </w:rPr>
-        <w:t xml:space="preserve">  ]</w:t>
-      </w:r>
-    </w:p>
-    <w:p>
-      <w:pPr>
-        <w:shd w:fill="F6F6F4" w:val="clear"/>
         <w:spacing w:after="160" w:before="0" w:line="240"/>
         <w:ind w:left="180" w:right="180"/>
       </w:pPr>
@@ -20517,7 +20457,7 @@
           <w:sz w:val="17"/>
           <w:szCs w:val="17"/>
         </w:rPr>
-        <w:t xml:space="preserve">}</w:t>
+        <w:t xml:space="preserve">  …</w:t>
       </w:r>
     </w:p>
     <w:p>
@@ -20789,7 +20729,22 @@
           <w:sz w:val="17"/>
           <w:szCs w:val="17"/>
         </w:rPr>
-        <w:t xml:space="preserve">      "serial": "CERT-2026-AUZ21L",</w:t>
+        <w:t xml:space="preserve">      "image": "http://127.0.0.1:8009/storage/uploads/certificate-template.png",</w:t>
+      </w:r>
+    </w:p>
+    <w:p>
+      <w:pPr>
+        <w:shd w:fill="F6F6F4" w:val="clear"/>
+        <w:spacing w:after="0" w:before="0" w:line="240"/>
+        <w:ind w:left="180" w:right="180"/>
+      </w:pPr>
+      <w:r>
+        <w:rPr>
+          <w:rFonts w:ascii="Consolas" w:cs="Consolas" w:eastAsia="Consolas" w:hAnsi="Consolas"/>
+          <w:sz w:val="17"/>
+          <w:szCs w:val="17"/>
+        </w:rPr>
+        <w:t xml:space="preserve">      "serial": "CERT-2026-9TNCHK",</w:t>
       </w:r>
     </w:p>
     <w:p>
@@ -20819,7 +20774,7 @@
           <w:sz w:val="17"/>
           <w:szCs w:val="17"/>
         </w:rPr>
-        <w:t xml:space="preserve">      "verification_url": "http://127.0.0.1:8007/api/certificates/verify/48339f03-952f-4793-992c-ff0da61cbc4a",</w:t>
+        <w:t xml:space="preserve">      "verification_url": "http://127.0.0.1:8009/api/certificates/verify/55842955-a81f-4ceb-afea-76935bf94fc6",</w:t>
       </w:r>
     </w:p>
     <w:p>
@@ -21029,6 +20984,21 @@
           <w:sz w:val="17"/>
           <w:szCs w:val="17"/>
         </w:rPr>
+        <w:t xml:space="preserve">      "image": "http://127.0.0.1:8009/storage/uploads/certificate-template.png",</w:t>
+      </w:r>
+    </w:p>
+    <w:p>
+      <w:pPr>
+        <w:shd w:fill="F6F6F4" w:val="clear"/>
+        <w:spacing w:after="0" w:before="0" w:line="240"/>
+        <w:ind w:left="180" w:right="180"/>
+      </w:pPr>
+      <w:r>
+        <w:rPr>
+          <w:rFonts w:ascii="Consolas" w:cs="Consolas" w:eastAsia="Consolas" w:hAnsi="Consolas"/>
+          <w:sz w:val="17"/>
+          <w:szCs w:val="17"/>
+        </w:rPr>
         <w:t xml:space="preserve">      "serial": null,</w:t>
       </w:r>
     </w:p>
@@ -21180,111 +21150,6 @@
           <w:szCs w:val="17"/>
         </w:rPr>
         <w:t xml:space="preserve">        "id": 3,</w:t>
-      </w:r>
-    </w:p>
-    <w:p>
-      <w:pPr>
-        <w:shd w:fill="F6F6F4" w:val="clear"/>
-        <w:spacing w:after="0" w:before="0" w:line="240"/>
-        <w:ind w:left="180" w:right="180"/>
-      </w:pPr>
-      <w:r>
-        <w:rPr>
-          <w:rFonts w:ascii="Consolas" w:cs="Consolas" w:eastAsia="Consolas" w:hAnsi="Consolas"/>
-          <w:sz w:val="17"/>
-          <w:szCs w:val="17"/>
-        </w:rPr>
-        <w:t xml:space="preserve">        "title": "The Great Books: A Reader's Guide"</w:t>
-      </w:r>
-    </w:p>
-    <w:p>
-      <w:pPr>
-        <w:shd w:fill="F6F6F4" w:val="clear"/>
-        <w:spacing w:after="0" w:before="0" w:line="240"/>
-        <w:ind w:left="180" w:right="180"/>
-      </w:pPr>
-      <w:r>
-        <w:rPr>
-          <w:rFonts w:ascii="Consolas" w:cs="Consolas" w:eastAsia="Consolas" w:hAnsi="Consolas"/>
-          <w:sz w:val="17"/>
-          <w:szCs w:val="17"/>
-        </w:rPr>
-        <w:t xml:space="preserve">      },</w:t>
-      </w:r>
-    </w:p>
-    <w:p>
-      <w:pPr>
-        <w:shd w:fill="F6F6F4" w:val="clear"/>
-        <w:spacing w:after="0" w:before="0" w:line="240"/>
-        <w:ind w:left="180" w:right="180"/>
-      </w:pPr>
-      <w:r>
-        <w:rPr>
-          <w:rFonts w:ascii="Consolas" w:cs="Consolas" w:eastAsia="Consolas" w:hAnsi="Consolas"/>
-          <w:sz w:val="17"/>
-          <w:szCs w:val="17"/>
-        </w:rPr>
-        <w:t xml:space="preserve">      "level": null,</w:t>
-      </w:r>
-    </w:p>
-    <w:p>
-      <w:pPr>
-        <w:shd w:fill="F6F6F4" w:val="clear"/>
-        <w:spacing w:after="0" w:before="0" w:line="240"/>
-        <w:ind w:left="180" w:right="180"/>
-      </w:pPr>
-      <w:r>
-        <w:rPr>
-          <w:rFonts w:ascii="Consolas" w:cs="Consolas" w:eastAsia="Consolas" w:hAnsi="Consolas"/>
-          <w:sz w:val="17"/>
-          <w:szCs w:val="17"/>
-        </w:rPr>
-        <w:t xml:space="preserve">      "title": "The Great Books: A Reader's Guide",</w:t>
-      </w:r>
-    </w:p>
-    <w:p>
-      <w:pPr>
-        <w:shd w:fill="F6F6F4" w:val="clear"/>
-        <w:spacing w:after="0" w:before="0" w:line="240"/>
-        <w:ind w:left="180" w:right="180"/>
-      </w:pPr>
-      <w:r>
-        <w:rPr>
-          <w:rFonts w:ascii="Consolas" w:cs="Consolas" w:eastAsia="Consolas" w:hAnsi="Consolas"/>
-          <w:sz w:val="17"/>
-          <w:szCs w:val="17"/>
-        </w:rPr>
-        <w:t xml:space="preserve">      "earned": false,</w:t>
-      </w:r>
-    </w:p>
-    <w:p>
-      <w:pPr>
-        <w:shd w:fill="F6F6F4" w:val="clear"/>
-        <w:spacing w:after="0" w:before="0" w:line="240"/>
-        <w:ind w:left="180" w:right="180"/>
-      </w:pPr>
-      <w:r>
-        <w:rPr>
-          <w:rFonts w:ascii="Consolas" w:cs="Consolas" w:eastAsia="Consolas" w:hAnsi="Consolas"/>
-          <w:sz w:val="17"/>
-          <w:szCs w:val="17"/>
-        </w:rPr>
-        <w:t xml:space="preserve">      "serial": null,</w:t>
-      </w:r>
-    </w:p>
-    <w:p>
-      <w:pPr>
-        <w:shd w:fill="F6F6F4" w:val="clear"/>
-        <w:spacing w:after="0" w:before="0" w:line="240"/>
-        <w:ind w:left="180" w:right="180"/>
-      </w:pPr>
-      <w:r>
-        <w:rPr>
-          <w:rFonts w:ascii="Consolas" w:cs="Consolas" w:eastAsia="Consolas" w:hAnsi="Consolas"/>
-          <w:sz w:val="17"/>
-          <w:szCs w:val="17"/>
-        </w:rPr>
-        <w:t xml:space="preserve">      "issued_at": null,</w:t>
       </w:r>
     </w:p>
     <w:p>
@@ -21345,7 +21210,7 @@
           <w:sz w:val="17"/>
           <w:szCs w:val="17"/>
         </w:rPr>
-        <w:t xml:space="preserve">GET /api/certificates/verify/48339f03-952f-4793-992c-ff0da61cbc4a</w:t>
+        <w:t xml:space="preserve">GET /api/certificates/verify/55842955-a81f-4ceb-afea-76935bf94fc6</w:t>
       </w:r>
     </w:p>
     <w:p>
@@ -21435,7 +21300,7 @@
           <w:sz w:val="17"/>
           <w:szCs w:val="17"/>
         </w:rPr>
-        <w:t xml:space="preserve">  "serial": "CERT-2026-AUZ21L",</w:t>
+        <w:t xml:space="preserve">  "serial": "CERT-2026-9TNCHK",</w:t>
       </w:r>
     </w:p>
     <w:p>
@@ -21854,7 +21719,7 @@
           <w:sz w:val="17"/>
           <w:szCs w:val="17"/>
         </w:rPr>
-        <w:t xml:space="preserve">      "id": 77,</w:t>
+        <w:t xml:space="preserve">      "id": 85,</w:t>
       </w:r>
     </w:p>
     <w:p>
@@ -21884,6 +21749,156 @@
           <w:sz w:val="17"/>
           <w:szCs w:val="17"/>
         </w:rPr>
+        <w:t xml:space="preserve">      "title": "New badge: The Persistent",</w:t>
+      </w:r>
+    </w:p>
+    <w:p>
+      <w:pPr>
+        <w:shd w:fill="F6F6F4" w:val="clear"/>
+        <w:spacing w:after="0" w:before="0" w:line="240"/>
+        <w:ind w:left="180" w:right="180"/>
+      </w:pPr>
+      <w:r>
+        <w:rPr>
+          <w:rFonts w:ascii="Consolas" w:cs="Consolas" w:eastAsia="Consolas" w:hAnsi="Consolas"/>
+          <w:sz w:val="17"/>
+          <w:szCs w:val="17"/>
+        </w:rPr>
+        <w:t xml:space="preserve">      "body": "Congratulations — “The Persistent” has been added to your badges.",</w:t>
+      </w:r>
+    </w:p>
+    <w:p>
+      <w:pPr>
+        <w:shd w:fill="F6F6F4" w:val="clear"/>
+        <w:spacing w:after="0" w:before="0" w:line="240"/>
+        <w:ind w:left="180" w:right="180"/>
+      </w:pPr>
+      <w:r>
+        <w:rPr>
+          <w:rFonts w:ascii="Consolas" w:cs="Consolas" w:eastAsia="Consolas" w:hAnsi="Consolas"/>
+          <w:sz w:val="17"/>
+          <w:szCs w:val="17"/>
+        </w:rPr>
+        <w:t xml:space="preserve">      "image": "http://127.0.0.1:8009/assets/badge.png",</w:t>
+      </w:r>
+    </w:p>
+    <w:p>
+      <w:pPr>
+        <w:shd w:fill="F6F6F4" w:val="clear"/>
+        <w:spacing w:after="0" w:before="0" w:line="240"/>
+        <w:ind w:left="180" w:right="180"/>
+      </w:pPr>
+      <w:r>
+        <w:rPr>
+          <w:rFonts w:ascii="Consolas" w:cs="Consolas" w:eastAsia="Consolas" w:hAnsi="Consolas"/>
+          <w:sz w:val="17"/>
+          <w:szCs w:val="17"/>
+        </w:rPr>
+        <w:t xml:space="preserve">      "category": "badge",</w:t>
+      </w:r>
+    </w:p>
+    <w:p>
+      <w:pPr>
+        <w:shd w:fill="F6F6F4" w:val="clear"/>
+        <w:spacing w:after="0" w:before="0" w:line="240"/>
+        <w:ind w:left="180" w:right="180"/>
+      </w:pPr>
+      <w:r>
+        <w:rPr>
+          <w:rFonts w:ascii="Consolas" w:cs="Consolas" w:eastAsia="Consolas" w:hAnsi="Consolas"/>
+          <w:sz w:val="17"/>
+          <w:szCs w:val="17"/>
+        </w:rPr>
+        <w:t xml:space="preserve">      "published_at": "2026-10-17T10:06:15+00:00",</w:t>
+      </w:r>
+    </w:p>
+    <w:p>
+      <w:pPr>
+        <w:shd w:fill="F6F6F4" w:val="clear"/>
+        <w:spacing w:after="0" w:before="0" w:line="240"/>
+        <w:ind w:left="180" w:right="180"/>
+      </w:pPr>
+      <w:r>
+        <w:rPr>
+          <w:rFonts w:ascii="Consolas" w:cs="Consolas" w:eastAsia="Consolas" w:hAnsi="Consolas"/>
+          <w:sz w:val="17"/>
+          <w:szCs w:val="17"/>
+        </w:rPr>
+        <w:t xml:space="preserve">      "read": false</w:t>
+      </w:r>
+    </w:p>
+    <w:p>
+      <w:pPr>
+        <w:shd w:fill="F6F6F4" w:val="clear"/>
+        <w:spacing w:after="0" w:before="0" w:line="240"/>
+        <w:ind w:left="180" w:right="180"/>
+      </w:pPr>
+      <w:r>
+        <w:rPr>
+          <w:rFonts w:ascii="Consolas" w:cs="Consolas" w:eastAsia="Consolas" w:hAnsi="Consolas"/>
+          <w:sz w:val="17"/>
+          <w:szCs w:val="17"/>
+        </w:rPr>
+        <w:t xml:space="preserve">    },</w:t>
+      </w:r>
+    </w:p>
+    <w:p>
+      <w:pPr>
+        <w:shd w:fill="F6F6F4" w:val="clear"/>
+        <w:spacing w:after="0" w:before="0" w:line="240"/>
+        <w:ind w:left="180" w:right="180"/>
+      </w:pPr>
+      <w:r>
+        <w:rPr>
+          <w:rFonts w:ascii="Consolas" w:cs="Consolas" w:eastAsia="Consolas" w:hAnsi="Consolas"/>
+          <w:sz w:val="17"/>
+          <w:szCs w:val="17"/>
+        </w:rPr>
+        <w:t xml:space="preserve">    {</w:t>
+      </w:r>
+    </w:p>
+    <w:p>
+      <w:pPr>
+        <w:shd w:fill="F6F6F4" w:val="clear"/>
+        <w:spacing w:after="0" w:before="0" w:line="240"/>
+        <w:ind w:left="180" w:right="180"/>
+      </w:pPr>
+      <w:r>
+        <w:rPr>
+          <w:rFonts w:ascii="Consolas" w:cs="Consolas" w:eastAsia="Consolas" w:hAnsi="Consolas"/>
+          <w:sz w:val="17"/>
+          <w:szCs w:val="17"/>
+        </w:rPr>
+        <w:t xml:space="preserve">      "id": 86,</w:t>
+      </w:r>
+    </w:p>
+    <w:p>
+      <w:pPr>
+        <w:shd w:fill="F6F6F4" w:val="clear"/>
+        <w:spacing w:after="0" w:before="0" w:line="240"/>
+        <w:ind w:left="180" w:right="180"/>
+      </w:pPr>
+      <w:r>
+        <w:rPr>
+          <w:rFonts w:ascii="Consolas" w:cs="Consolas" w:eastAsia="Consolas" w:hAnsi="Consolas"/>
+          <w:sz w:val="17"/>
+          <w:szCs w:val="17"/>
+        </w:rPr>
+        <w:t xml:space="preserve">      "tag": "Badge",</w:t>
+      </w:r>
+    </w:p>
+    <w:p>
+      <w:pPr>
+        <w:shd w:fill="F6F6F4" w:val="clear"/>
+        <w:spacing w:after="0" w:before="0" w:line="240"/>
+        <w:ind w:left="180" w:right="180"/>
+      </w:pPr>
+      <w:r>
+        <w:rPr>
+          <w:rFonts w:ascii="Consolas" w:cs="Consolas" w:eastAsia="Consolas" w:hAnsi="Consolas"/>
+          <w:sz w:val="17"/>
+          <w:szCs w:val="17"/>
+        </w:rPr>
         <w:t xml:space="preserve">      "title": "New badge: Book Finisher",</w:t>
       </w:r>
     </w:p>
@@ -21914,7 +21929,7 @@
           <w:sz w:val="17"/>
           <w:szCs w:val="17"/>
         </w:rPr>
-        <w:t xml:space="preserve">      "image": "http://127.0.0.1:8007/assets/badge.png",</w:t>
+        <w:t xml:space="preserve">      "image": "http://127.0.0.1:8009/assets/badge.png",</w:t>
       </w:r>
     </w:p>
     <w:p>
@@ -21944,7 +21959,7 @@
           <w:sz w:val="17"/>
           <w:szCs w:val="17"/>
         </w:rPr>
-        <w:t xml:space="preserve">      "published_at": "2026-10-17T09:38:42+00:00",</w:t>
+        <w:t xml:space="preserve">      "published_at": "2026-10-17T10:06:15+00:00",</w:t>
       </w:r>
     </w:p>
     <w:p>
@@ -22004,7 +22019,7 @@
           <w:sz w:val="17"/>
           <w:szCs w:val="17"/>
         </w:rPr>
-        <w:t xml:space="preserve">      "id": 78,</w:t>
+        <w:t xml:space="preserve">      "id": 87,</w:t>
       </w:r>
     </w:p>
     <w:p>
@@ -22035,126 +22050,6 @@
           <w:szCs w:val="17"/>
         </w:rPr>
         <w:t xml:space="preserve">      "title": "Your certificate for “Introduction to Structured Reading” has been issued",</w:t>
-      </w:r>
-    </w:p>
-    <w:p>
-      <w:pPr>
-        <w:shd w:fill="F6F6F4" w:val="clear"/>
-        <w:spacing w:after="0" w:before="0" w:line="240"/>
-        <w:ind w:left="180" w:right="180"/>
-      </w:pPr>
-      <w:r>
-        <w:rPr>
-          <w:rFonts w:ascii="Consolas" w:cs="Consolas" w:eastAsia="Consolas" w:hAnsi="Consolas"/>
-          <w:sz w:val="17"/>
-          <w:szCs w:val="17"/>
-        </w:rPr>
-        <w:t xml:space="preserve">      "body": "Congratulations — your certificate for “Introduction to Structured Reading” has been issued with serial CERT-2026-AUZ21L. You will find it on the certificates page.",</w:t>
-      </w:r>
-    </w:p>
-    <w:p>
-      <w:pPr>
-        <w:shd w:fill="F6F6F4" w:val="clear"/>
-        <w:spacing w:after="0" w:before="0" w:line="240"/>
-        <w:ind w:left="180" w:right="180"/>
-      </w:pPr>
-      <w:r>
-        <w:rPr>
-          <w:rFonts w:ascii="Consolas" w:cs="Consolas" w:eastAsia="Consolas" w:hAnsi="Consolas"/>
-          <w:sz w:val="17"/>
-          <w:szCs w:val="17"/>
-        </w:rPr>
-        <w:t xml:space="preserve">      "image": null,</w:t>
-      </w:r>
-    </w:p>
-    <w:p>
-      <w:pPr>
-        <w:shd w:fill="F6F6F4" w:val="clear"/>
-        <w:spacing w:after="0" w:before="0" w:line="240"/>
-        <w:ind w:left="180" w:right="180"/>
-      </w:pPr>
-      <w:r>
-        <w:rPr>
-          <w:rFonts w:ascii="Consolas" w:cs="Consolas" w:eastAsia="Consolas" w:hAnsi="Consolas"/>
-          <w:sz w:val="17"/>
-          <w:szCs w:val="17"/>
-        </w:rPr>
-        <w:t xml:space="preserve">      "category": "certificate",</w:t>
-      </w:r>
-    </w:p>
-    <w:p>
-      <w:pPr>
-        <w:shd w:fill="F6F6F4" w:val="clear"/>
-        <w:spacing w:after="0" w:before="0" w:line="240"/>
-        <w:ind w:left="180" w:right="180"/>
-      </w:pPr>
-      <w:r>
-        <w:rPr>
-          <w:rFonts w:ascii="Consolas" w:cs="Consolas" w:eastAsia="Consolas" w:hAnsi="Consolas"/>
-          <w:sz w:val="17"/>
-          <w:szCs w:val="17"/>
-        </w:rPr>
-        <w:t xml:space="preserve">      "published_at": "2026-10-17T09:38:42+00:00",</w:t>
-      </w:r>
-    </w:p>
-    <w:p>
-      <w:pPr>
-        <w:shd w:fill="F6F6F4" w:val="clear"/>
-        <w:spacing w:after="0" w:before="0" w:line="240"/>
-        <w:ind w:left="180" w:right="180"/>
-      </w:pPr>
-      <w:r>
-        <w:rPr>
-          <w:rFonts w:ascii="Consolas" w:cs="Consolas" w:eastAsia="Consolas" w:hAnsi="Consolas"/>
-          <w:sz w:val="17"/>
-          <w:szCs w:val="17"/>
-        </w:rPr>
-        <w:t xml:space="preserve">      "read": false</w:t>
-      </w:r>
-    </w:p>
-    <w:p>
-      <w:pPr>
-        <w:shd w:fill="F6F6F4" w:val="clear"/>
-        <w:spacing w:after="0" w:before="0" w:line="240"/>
-        <w:ind w:left="180" w:right="180"/>
-      </w:pPr>
-      <w:r>
-        <w:rPr>
-          <w:rFonts w:ascii="Consolas" w:cs="Consolas" w:eastAsia="Consolas" w:hAnsi="Consolas"/>
-          <w:sz w:val="17"/>
-          <w:szCs w:val="17"/>
-        </w:rPr>
-        <w:t xml:space="preserve">    },</w:t>
-      </w:r>
-    </w:p>
-    <w:p>
-      <w:pPr>
-        <w:shd w:fill="F6F6F4" w:val="clear"/>
-        <w:spacing w:after="0" w:before="0" w:line="240"/>
-        <w:ind w:left="180" w:right="180"/>
-      </w:pPr>
-      <w:r>
-        <w:rPr>
-          <w:rFonts w:ascii="Consolas" w:cs="Consolas" w:eastAsia="Consolas" w:hAnsi="Consolas"/>
-          <w:sz w:val="17"/>
-          <w:szCs w:val="17"/>
-        </w:rPr>
-        <w:t xml:space="preserve">    {</w:t>
-      </w:r>
-    </w:p>
-    <w:p>
-      <w:pPr>
-        <w:shd w:fill="F6F6F4" w:val="clear"/>
-        <w:spacing w:after="0" w:before="0" w:line="240"/>
-        <w:ind w:left="180" w:right="180"/>
-      </w:pPr>
-      <w:r>
-        <w:rPr>
-          <w:rFonts w:ascii="Consolas" w:cs="Consolas" w:eastAsia="Consolas" w:hAnsi="Consolas"/>
-          <w:sz w:val="17"/>
-          <w:szCs w:val="17"/>
-        </w:rPr>
-        <w:t xml:space="preserve">      "id": 76,</w:t>
       </w:r>
     </w:p>
     <w:p>
@@ -22201,7 +22096,7 @@
           <w:sz w:val="17"/>
           <w:szCs w:val="17"/>
         </w:rPr>
-        <w:t xml:space="preserve">GET /api/announcements/77</w:t>
+        <w:t xml:space="preserve">GET /api/announcements/85</w:t>
       </w:r>
     </w:p>
     <w:p>
@@ -22306,7 +22201,7 @@
           <w:sz w:val="17"/>
           <w:szCs w:val="17"/>
         </w:rPr>
-        <w:t xml:space="preserve">    "id": 77,</w:t>
+        <w:t xml:space="preserve">    "id": 85,</w:t>
       </w:r>
     </w:p>
     <w:p>
@@ -22336,37 +22231,37 @@
           <w:sz w:val="17"/>
           <w:szCs w:val="17"/>
         </w:rPr>
-        <w:t xml:space="preserve">    "title": "New badge: Book Finisher",</w:t>
-      </w:r>
-    </w:p>
-    <w:p>
-      <w:pPr>
-        <w:shd w:fill="F6F6F4" w:val="clear"/>
-        <w:spacing w:after="0" w:before="0" w:line="240"/>
-        <w:ind w:left="180" w:right="180"/>
-      </w:pPr>
-      <w:r>
-        <w:rPr>
-          <w:rFonts w:ascii="Consolas" w:cs="Consolas" w:eastAsia="Consolas" w:hAnsi="Consolas"/>
-          <w:sz w:val="17"/>
-          <w:szCs w:val="17"/>
-        </w:rPr>
-        <w:t xml:space="preserve">    "body": "Congratulations — “Book Finisher” has been added to your badges.",</w:t>
-      </w:r>
-    </w:p>
-    <w:p>
-      <w:pPr>
-        <w:shd w:fill="F6F6F4" w:val="clear"/>
-        <w:spacing w:after="0" w:before="0" w:line="240"/>
-        <w:ind w:left="180" w:right="180"/>
-      </w:pPr>
-      <w:r>
-        <w:rPr>
-          <w:rFonts w:ascii="Consolas" w:cs="Consolas" w:eastAsia="Consolas" w:hAnsi="Consolas"/>
-          <w:sz w:val="17"/>
-          <w:szCs w:val="17"/>
-        </w:rPr>
-        <w:t xml:space="preserve">    "image": "http://127.0.0.1:8007/assets/badge.png",</w:t>
+        <w:t xml:space="preserve">    "title": "New badge: The Persistent",</w:t>
+      </w:r>
+    </w:p>
+    <w:p>
+      <w:pPr>
+        <w:shd w:fill="F6F6F4" w:val="clear"/>
+        <w:spacing w:after="0" w:before="0" w:line="240"/>
+        <w:ind w:left="180" w:right="180"/>
+      </w:pPr>
+      <w:r>
+        <w:rPr>
+          <w:rFonts w:ascii="Consolas" w:cs="Consolas" w:eastAsia="Consolas" w:hAnsi="Consolas"/>
+          <w:sz w:val="17"/>
+          <w:szCs w:val="17"/>
+        </w:rPr>
+        <w:t xml:space="preserve">    "body": "Congratulations — “The Persistent” has been added to your badges.",</w:t>
+      </w:r>
+    </w:p>
+    <w:p>
+      <w:pPr>
+        <w:shd w:fill="F6F6F4" w:val="clear"/>
+        <w:spacing w:after="0" w:before="0" w:line="240"/>
+        <w:ind w:left="180" w:right="180"/>
+      </w:pPr>
+      <w:r>
+        <w:rPr>
+          <w:rFonts w:ascii="Consolas" w:cs="Consolas" w:eastAsia="Consolas" w:hAnsi="Consolas"/>
+          <w:sz w:val="17"/>
+          <w:szCs w:val="17"/>
+        </w:rPr>
+        <w:t xml:space="preserve">    "image": "http://127.0.0.1:8009/assets/badge.png",</w:t>
       </w:r>
     </w:p>
     <w:p>
@@ -22396,7 +22291,7 @@
           <w:sz w:val="17"/>
           <w:szCs w:val="17"/>
         </w:rPr>
-        <w:t xml:space="preserve">    "published_at": "2026-10-17T09:38:42+00:00",</w:t>
+        <w:t xml:space="preserve">    "published_at": "2026-10-17T10:06:15+00:00",</w:t>
       </w:r>
     </w:p>
     <w:p>
@@ -22473,7 +22368,7 @@
           <w:sz w:val="17"/>
           <w:szCs w:val="17"/>
         </w:rPr>
-        <w:t xml:space="preserve">POST /api/announcements/77/read</w:t>
+        <w:t xml:space="preserve">POST /api/announcements/85/read</w:t>
       </w:r>
     </w:p>
     <w:p>
@@ -22578,7 +22473,7 @@
           <w:sz w:val="17"/>
           <w:szCs w:val="17"/>
         </w:rPr>
-        <w:t xml:space="preserve">    "id": 77,</w:t>
+        <w:t xml:space="preserve">    "id": 85,</w:t>
       </w:r>
     </w:p>
     <w:p>
@@ -24309,7 +24204,7 @@
           <w:sz w:val="17"/>
           <w:szCs w:val="17"/>
         </w:rPr>
-        <w:t xml:space="preserve">    "id": 14,</w:t>
+        <w:t xml:space="preserve">    "id": 16,</w:t>
       </w:r>
     </w:p>
     <w:p>
@@ -24339,7 +24234,7 @@
           <w:sz w:val="17"/>
           <w:szCs w:val="17"/>
         </w:rPr>
-        <w:t xml:space="preserve">    "email": "api1792229900@himam.test",</w:t>
+        <w:t xml:space="preserve">    "email": "api1792231566@himam.test",</w:t>
       </w:r>
     </w:p>
     <w:p>
@@ -24489,7 +24384,7 @@
           <w:sz w:val="17"/>
           <w:szCs w:val="17"/>
         </w:rPr>
-        <w:t xml:space="preserve">    "created_at": "2026-10-17T09:38:21+00:00"</w:t>
+        <w:t xml:space="preserve">    "created_at": "2026-10-17T10:06:06+00:00"</w:t>
       </w:r>
     </w:p>
     <w:p>
@@ -25167,7 +25062,7 @@
           <w:sz w:val="17"/>
           <w:szCs w:val="17"/>
         </w:rPr>
-        <w:t xml:space="preserve">  "email": "api1792229900@himam.test",</w:t>
+        <w:t xml:space="preserve">  "email": "api1792231566@himam.test",</w:t>
       </w:r>
     </w:p>
     <w:p>
@@ -32578,7 +32473,7 @@
           <w:sz w:val="25"/>
           <w:szCs w:val="25"/>
         </w:rPr>
-        <w:t xml:space="preserve">Reader API — 40 endpoints</w:t>
+        <w:t xml:space="preserve">Reader API — 41 endpoints</w:t>
       </w:r>
     </w:p>
     <w:tbl>
@@ -34098,6 +33993,82 @@
                 <w:szCs w:val="19"/>
               </w:rPr>
               <w:t xml:space="preserve">/api/certificates/verify/{code}</w:t>
+            </w:r>
+          </w:p>
+        </w:tc>
+        <w:tc>
+          <w:tcPr>
+            <w:tcMar>
+              <w:top w:type="dxa" w:w="60"/>
+              <w:left w:type="dxa" w:w="120"/>
+              <w:bottom w:type="dxa" w:w="60"/>
+              <w:right w:type="dxa" w:w="120"/>
+            </w:tcMar>
+          </w:tcPr>
+          <w:p>
+            <w:pPr>
+              <w:spacing w:after="40" w:before="40"/>
+            </w:pPr>
+            <w:r>
+              <w:rPr>
+                <w:rFonts w:ascii="Calibri" w:cs="Calibri" w:eastAsia="Calibri" w:hAnsi="Calibri"/>
+                <w:sz w:val="21"/>
+                <w:szCs w:val="21"/>
+              </w:rPr>
+              <w:t xml:space="preserve">public</w:t>
+            </w:r>
+          </w:p>
+        </w:tc>
+      </w:tr>
+      <w:tr>
+        <w:trPr>
+          <w:tblHeader w:val="off"/>
+        </w:trPr>
+        <w:tc>
+          <w:tcPr>
+            <w:tcMar>
+              <w:top w:type="dxa" w:w="60"/>
+              <w:left w:type="dxa" w:w="120"/>
+              <w:bottom w:type="dxa" w:w="60"/>
+              <w:right w:type="dxa" w:w="120"/>
+            </w:tcMar>
+          </w:tcPr>
+          <w:p>
+            <w:pPr>
+              <w:spacing w:after="40" w:before="40"/>
+            </w:pPr>
+            <w:r>
+              <w:rPr>
+                <w:rFonts w:ascii="Consolas" w:cs="Consolas" w:eastAsia="Consolas" w:hAnsi="Consolas"/>
+                <w:color w:val="A33B00"/>
+                <w:sz w:val="19"/>
+                <w:szCs w:val="19"/>
+              </w:rPr>
+              <w:t xml:space="preserve">GET</w:t>
+            </w:r>
+          </w:p>
+        </w:tc>
+        <w:tc>
+          <w:tcPr>
+            <w:tcMar>
+              <w:top w:type="dxa" w:w="60"/>
+              <w:left w:type="dxa" w:w="120"/>
+              <w:bottom w:type="dxa" w:w="60"/>
+              <w:right w:type="dxa" w:w="120"/>
+            </w:tcMar>
+          </w:tcPr>
+          <w:p>
+            <w:pPr>
+              <w:spacing w:after="40" w:before="40"/>
+            </w:pPr>
+            <w:r>
+              <w:rPr>
+                <w:rFonts w:ascii="Consolas" w:cs="Consolas" w:eastAsia="Consolas" w:hAnsi="Consolas"/>
+                <w:color w:val="A33B00"/>
+                <w:sz w:val="19"/>
+                <w:szCs w:val="19"/>
+              </w:rPr>
+              <w:t xml:space="preserve">/api/certificates/verify/{code}/image</w:t>
             </w:r>
           </w:p>
         </w:tc>

</xml_diff>